<commit_message>
Dejar solo espacios y medidas de diseño en la tabla
Se quitan las filas de trámites y proceso constructivo (licencias de los
artículos 13, 17 y 26, ejecución de obra de los artículos 233, 242 y 244,
conservación del artículo 48) y las que no aplican a una casa habitación
(elevador del artículo 193, extintores del 216 con su clasificación del
208, mecánica de suelos del 185).

La tabla pasa de 164 a 144 filas, todas de espacios, dimensiones y
requisitos técnicos de diseño.

Co-Authored-By: Claude Opus 5 <noreply@anthropic.com>
Claude-Session: https://claude.ai/code/session_0135TezUpzBNrSUWx2ifL95q
</commit_message>
<xml_diff>
--- a/tarea/Medidas_basicas_de_una_casa.docx
+++ b/tarea/Medidas_basicas_de_una_casa.docx
@@ -489,670 +489,6 @@
                 <w:sz w:val="22"/>
                 <w:szCs w:val="22"/>
               </w:rPr>
-              <w:t xml:space="preserve">Vivienda unifamiliar</w:t>
-            </w:r>
-          </w:p>
-        </w:tc>
-        <w:tc>
-          <w:tcPr>
-            <w:tcW w:type="dxa" w:w="1620"/>
-            <w:tcMar>
-              <w:top w:type="dxa" w:w="60"/>
-              <w:left w:type="dxa" w:w="100"/>
-              <w:bottom w:type="dxa" w:w="60"/>
-              <w:right w:type="dxa" w:w="100"/>
-            </w:tcMar>
-            <w:vAlign w:val="center"/>
-          </w:tcPr>
-          <w:p>
-            <w:pPr>
-              <w:spacing w:after="0" w:line="252"/>
-            </w:pPr>
-            <w:r>
-              <w:rPr>
-                <w:rFonts w:ascii="Arial" w:cs="Arial" w:eastAsia="Arial" w:hAnsi="Arial"/>
-                <w:b w:val="false"/>
-                <w:bCs w:val="false"/>
-                <w:sz w:val="22"/>
-                <w:szCs w:val="22"/>
-              </w:rPr>
-              <w:t xml:space="preserve">Artículo 13</w:t>
-            </w:r>
-          </w:p>
-        </w:tc>
-        <w:tc>
-          <w:tcPr>
-            <w:tcW w:type="dxa" w:w="5040"/>
-            <w:tcMar>
-              <w:top w:type="dxa" w:w="60"/>
-              <w:left w:type="dxa" w:w="100"/>
-              <w:bottom w:type="dxa" w:w="60"/>
-              <w:right w:type="dxa" w:w="100"/>
-            </w:tcMar>
-            <w:vAlign w:val="center"/>
-          </w:tcPr>
-          <w:p>
-            <w:pPr>
-              <w:spacing w:after="0" w:line="252"/>
-            </w:pPr>
-            <w:r>
-              <w:rPr>
-                <w:rFonts w:ascii="Arial" w:cs="Arial" w:eastAsia="Arial" w:hAnsi="Arial"/>
-                <w:b w:val="false"/>
-                <w:bCs w:val="false"/>
-                <w:sz w:val="22"/>
-                <w:szCs w:val="22"/>
-              </w:rPr>
-              <w:t xml:space="preserve">Dentro del género habitación se clasifica como vivienda mínima, de una sola vivienda.</w:t>
-            </w:r>
-          </w:p>
-        </w:tc>
-      </w:tr>
-      <w:tr>
-        <w:tc>
-          <w:tcPr>
-            <w:tcW w:type="dxa" w:w="2340"/>
-            <w:tcMar>
-              <w:top w:type="dxa" w:w="60"/>
-              <w:left w:type="dxa" w:w="100"/>
-              <w:bottom w:type="dxa" w:w="60"/>
-              <w:right w:type="dxa" w:w="100"/>
-            </w:tcMar>
-            <w:vAlign w:val="center"/>
-          </w:tcPr>
-          <w:p>
-            <w:pPr>
-              <w:spacing w:after="0" w:line="252"/>
-            </w:pPr>
-            <w:r>
-              <w:rPr>
-                <w:rFonts w:ascii="Arial" w:cs="Arial" w:eastAsia="Arial" w:hAnsi="Arial"/>
-                <w:b/>
-                <w:bCs/>
-                <w:sz w:val="22"/>
-                <w:szCs w:val="22"/>
-              </w:rPr>
-              <w:t xml:space="preserve">Vivienda progresiva</w:t>
-            </w:r>
-          </w:p>
-        </w:tc>
-        <w:tc>
-          <w:tcPr>
-            <w:tcW w:type="dxa" w:w="1620"/>
-            <w:tcMar>
-              <w:top w:type="dxa" w:w="60"/>
-              <w:left w:type="dxa" w:w="100"/>
-              <w:bottom w:type="dxa" w:w="60"/>
-              <w:right w:type="dxa" w:w="100"/>
-            </w:tcMar>
-            <w:vAlign w:val="center"/>
-          </w:tcPr>
-          <w:p>
-            <w:pPr>
-              <w:spacing w:after="0" w:line="252"/>
-            </w:pPr>
-            <w:r>
-              <w:rPr>
-                <w:rFonts w:ascii="Arial" w:cs="Arial" w:eastAsia="Arial" w:hAnsi="Arial"/>
-                <w:b w:val="false"/>
-                <w:bCs w:val="false"/>
-                <w:sz w:val="22"/>
-                <w:szCs w:val="22"/>
-              </w:rPr>
-              <w:t xml:space="preserve">Artículo 13</w:t>
-            </w:r>
-          </w:p>
-        </w:tc>
-        <w:tc>
-          <w:tcPr>
-            <w:tcW w:type="dxa" w:w="5040"/>
-            <w:tcMar>
-              <w:top w:type="dxa" w:w="60"/>
-              <w:left w:type="dxa" w:w="100"/>
-              <w:bottom w:type="dxa" w:w="60"/>
-              <w:right w:type="dxa" w:w="100"/>
-            </w:tcMar>
-            <w:vAlign w:val="center"/>
-          </w:tcPr>
-          <w:p>
-            <w:pPr>
-              <w:spacing w:after="0" w:line="252"/>
-            </w:pPr>
-            <w:r>
-              <w:rPr>
-                <w:rFonts w:ascii="Arial" w:cs="Arial" w:eastAsia="Arial" w:hAnsi="Arial"/>
-                <w:b w:val="false"/>
-                <w:bCs w:val="false"/>
-                <w:sz w:val="22"/>
-                <w:szCs w:val="22"/>
-              </w:rPr>
-              <w:t xml:space="preserve">La obra por etapas se limita a 40 m² por etapa, con un tope de 120 m², dos niveles como máximo y claros no mayores de 4 m.</w:t>
-            </w:r>
-          </w:p>
-        </w:tc>
-      </w:tr>
-      <w:tr>
-        <w:tc>
-          <w:tcPr>
-            <w:tcW w:type="dxa" w:w="2340"/>
-            <w:tcMar>
-              <w:top w:type="dxa" w:w="60"/>
-              <w:left w:type="dxa" w:w="100"/>
-              <w:bottom w:type="dxa" w:w="60"/>
-              <w:right w:type="dxa" w:w="100"/>
-            </w:tcMar>
-            <w:vAlign w:val="center"/>
-          </w:tcPr>
-          <w:p>
-            <w:pPr>
-              <w:spacing w:after="0" w:line="252"/>
-            </w:pPr>
-            <w:r>
-              <w:rPr>
-                <w:rFonts w:ascii="Arial" w:cs="Arial" w:eastAsia="Arial" w:hAnsi="Arial"/>
-                <w:b/>
-                <w:bCs/>
-                <w:sz w:val="22"/>
-                <w:szCs w:val="22"/>
-              </w:rPr>
-              <w:t xml:space="preserve">Primera pieza de vivienda progresiva</w:t>
-            </w:r>
-          </w:p>
-        </w:tc>
-        <w:tc>
-          <w:tcPr>
-            <w:tcW w:type="dxa" w:w="1620"/>
-            <w:tcMar>
-              <w:top w:type="dxa" w:w="60"/>
-              <w:left w:type="dxa" w:w="100"/>
-              <w:bottom w:type="dxa" w:w="60"/>
-              <w:right w:type="dxa" w:w="100"/>
-            </w:tcMar>
-            <w:vAlign w:val="center"/>
-          </w:tcPr>
-          <w:p>
-            <w:pPr>
-              <w:spacing w:after="0" w:line="252"/>
-            </w:pPr>
-            <w:r>
-              <w:rPr>
-                <w:rFonts w:ascii="Arial" w:cs="Arial" w:eastAsia="Arial" w:hAnsi="Arial"/>
-                <w:b w:val="false"/>
-                <w:bCs w:val="false"/>
-                <w:sz w:val="22"/>
-                <w:szCs w:val="22"/>
-              </w:rPr>
-              <w:t xml:space="preserve">Artículo 26</w:t>
-            </w:r>
-          </w:p>
-        </w:tc>
-        <w:tc>
-          <w:tcPr>
-            <w:tcW w:type="dxa" w:w="5040"/>
-            <w:tcMar>
-              <w:top w:type="dxa" w:w="60"/>
-              <w:left w:type="dxa" w:w="100"/>
-              <w:bottom w:type="dxa" w:w="60"/>
-              <w:right w:type="dxa" w:w="100"/>
-            </w:tcMar>
-            <w:vAlign w:val="center"/>
-          </w:tcPr>
-          <w:p>
-            <w:pPr>
-              <w:spacing w:after="0" w:line="252"/>
-            </w:pPr>
-            <w:r>
-              <w:rPr>
-                <w:rFonts w:ascii="Arial" w:cs="Arial" w:eastAsia="Arial" w:hAnsi="Arial"/>
-                <w:b w:val="false"/>
-                <w:bCs w:val="false"/>
-                <w:sz w:val="22"/>
-                <w:szCs w:val="22"/>
-              </w:rPr>
-              <w:t xml:space="preserve">Se puede levantar sin licencia hasta 16 m² con sus servicios sanitarios, dando aviso por escrito y respetando uso de suelo, alineamiento y restricciones.</w:t>
-            </w:r>
-          </w:p>
-        </w:tc>
-      </w:tr>
-      <w:tr>
-        <w:tc>
-          <w:tcPr>
-            <w:tcW w:type="dxa" w:w="2340"/>
-            <w:tcMar>
-              <w:top w:type="dxa" w:w="60"/>
-              <w:left w:type="dxa" w:w="100"/>
-              <w:bottom w:type="dxa" w:w="60"/>
-              <w:right w:type="dxa" w:w="100"/>
-            </w:tcMar>
-            <w:vAlign w:val="center"/>
-          </w:tcPr>
-          <w:p>
-            <w:pPr>
-              <w:spacing w:after="0" w:line="252"/>
-            </w:pPr>
-            <w:r>
-              <w:rPr>
-                <w:rFonts w:ascii="Arial" w:cs="Arial" w:eastAsia="Arial" w:hAnsi="Arial"/>
-                <w:b/>
-                <w:bCs/>
-                <w:sz w:val="22"/>
-                <w:szCs w:val="22"/>
-              </w:rPr>
-              <w:t xml:space="preserve">Fosa séptica o albañal</w:t>
-            </w:r>
-          </w:p>
-        </w:tc>
-        <w:tc>
-          <w:tcPr>
-            <w:tcW w:type="dxa" w:w="1620"/>
-            <w:tcMar>
-              <w:top w:type="dxa" w:w="60"/>
-              <w:left w:type="dxa" w:w="100"/>
-              <w:bottom w:type="dxa" w:w="60"/>
-              <w:right w:type="dxa" w:w="100"/>
-            </w:tcMar>
-            <w:vAlign w:val="center"/>
-          </w:tcPr>
-          <w:p>
-            <w:pPr>
-              <w:spacing w:after="0" w:line="252"/>
-            </w:pPr>
-            <w:r>
-              <w:rPr>
-                <w:rFonts w:ascii="Arial" w:cs="Arial" w:eastAsia="Arial" w:hAnsi="Arial"/>
-                <w:b w:val="false"/>
-                <w:bCs w:val="false"/>
-                <w:sz w:val="22"/>
-                <w:szCs w:val="22"/>
-              </w:rPr>
-              <w:t xml:space="preserve">Artículo 26</w:t>
-            </w:r>
-          </w:p>
-        </w:tc>
-        <w:tc>
-          <w:tcPr>
-            <w:tcW w:type="dxa" w:w="5040"/>
-            <w:tcMar>
-              <w:top w:type="dxa" w:w="60"/>
-              <w:left w:type="dxa" w:w="100"/>
-              <w:bottom w:type="dxa" w:w="60"/>
-              <w:right w:type="dxa" w:w="100"/>
-            </w:tcMar>
-            <w:vAlign w:val="center"/>
-          </w:tcPr>
-          <w:p>
-            <w:pPr>
-              <w:spacing w:after="0" w:line="252"/>
-            </w:pPr>
-            <w:r>
-              <w:rPr>
-                <w:rFonts w:ascii="Arial" w:cs="Arial" w:eastAsia="Arial" w:hAnsi="Arial"/>
-                <w:b w:val="false"/>
-                <w:bCs w:val="false"/>
-                <w:sz w:val="22"/>
-                <w:szCs w:val="22"/>
-              </w:rPr>
-              <w:t xml:space="preserve">Instalarlos en casa habitación no necesita licencia.</w:t>
-            </w:r>
-          </w:p>
-        </w:tc>
-      </w:tr>
-      <w:tr>
-        <w:tc>
-          <w:tcPr>
-            <w:tcW w:type="dxa" w:w="2340"/>
-            <w:tcMar>
-              <w:top w:type="dxa" w:w="60"/>
-              <w:left w:type="dxa" w:w="100"/>
-              <w:bottom w:type="dxa" w:w="60"/>
-              <w:right w:type="dxa" w:w="100"/>
-            </w:tcMar>
-            <w:vAlign w:val="center"/>
-          </w:tcPr>
-          <w:p>
-            <w:pPr>
-              <w:spacing w:after="0" w:line="252"/>
-            </w:pPr>
-            <w:r>
-              <w:rPr>
-                <w:rFonts w:ascii="Arial" w:cs="Arial" w:eastAsia="Arial" w:hAnsi="Arial"/>
-                <w:b/>
-                <w:bCs/>
-                <w:sz w:val="22"/>
-                <w:szCs w:val="22"/>
-              </w:rPr>
-              <w:t xml:space="preserve">Apertura de claros</w:t>
-            </w:r>
-          </w:p>
-        </w:tc>
-        <w:tc>
-          <w:tcPr>
-            <w:tcW w:type="dxa" w:w="1620"/>
-            <w:tcMar>
-              <w:top w:type="dxa" w:w="60"/>
-              <w:left w:type="dxa" w:w="100"/>
-              <w:bottom w:type="dxa" w:w="60"/>
-              <w:right w:type="dxa" w:w="100"/>
-            </w:tcMar>
-            <w:vAlign w:val="center"/>
-          </w:tcPr>
-          <w:p>
-            <w:pPr>
-              <w:spacing w:after="0" w:line="252"/>
-            </w:pPr>
-            <w:r>
-              <w:rPr>
-                <w:rFonts w:ascii="Arial" w:cs="Arial" w:eastAsia="Arial" w:hAnsi="Arial"/>
-                <w:b w:val="false"/>
-                <w:bCs w:val="false"/>
-                <w:sz w:val="22"/>
-                <w:szCs w:val="22"/>
-              </w:rPr>
-              <w:t xml:space="preserve">Artículo 26</w:t>
-            </w:r>
-          </w:p>
-        </w:tc>
-        <w:tc>
-          <w:tcPr>
-            <w:tcW w:type="dxa" w:w="5040"/>
-            <w:tcMar>
-              <w:top w:type="dxa" w:w="60"/>
-              <w:left w:type="dxa" w:w="100"/>
-              <w:bottom w:type="dxa" w:w="60"/>
-              <w:right w:type="dxa" w:w="100"/>
-            </w:tcMar>
-            <w:vAlign w:val="center"/>
-          </w:tcPr>
-          <w:p>
-            <w:pPr>
-              <w:spacing w:after="0" w:line="252"/>
-            </w:pPr>
-            <w:r>
-              <w:rPr>
-                <w:rFonts w:ascii="Arial" w:cs="Arial" w:eastAsia="Arial" w:hAnsi="Arial"/>
-                <w:b w:val="false"/>
-                <w:bCs w:val="false"/>
-                <w:sz w:val="22"/>
-                <w:szCs w:val="22"/>
-              </w:rPr>
-              <w:t xml:space="preserve">Hasta 1.50 m como máximo en construcciones de hasta dos niveles, si no se afectan elementos estructurales.</w:t>
-            </w:r>
-          </w:p>
-        </w:tc>
-      </w:tr>
-      <w:tr>
-        <w:tc>
-          <w:tcPr>
-            <w:tcW w:type="dxa" w:w="2340"/>
-            <w:tcMar>
-              <w:top w:type="dxa" w:w="60"/>
-              <w:left w:type="dxa" w:w="100"/>
-              <w:bottom w:type="dxa" w:w="60"/>
-              <w:right w:type="dxa" w:w="100"/>
-            </w:tcMar>
-            <w:vAlign w:val="center"/>
-          </w:tcPr>
-          <w:p>
-            <w:pPr>
-              <w:spacing w:after="0" w:line="252"/>
-            </w:pPr>
-            <w:r>
-              <w:rPr>
-                <w:rFonts w:ascii="Arial" w:cs="Arial" w:eastAsia="Arial" w:hAnsi="Arial"/>
-                <w:b/>
-                <w:bCs/>
-                <w:sz w:val="22"/>
-                <w:szCs w:val="22"/>
-              </w:rPr>
-              <w:t xml:space="preserve">Impermeabilización de azotea</w:t>
-            </w:r>
-          </w:p>
-        </w:tc>
-        <w:tc>
-          <w:tcPr>
-            <w:tcW w:type="dxa" w:w="1620"/>
-            <w:tcMar>
-              <w:top w:type="dxa" w:w="60"/>
-              <w:left w:type="dxa" w:w="100"/>
-              <w:bottom w:type="dxa" w:w="60"/>
-              <w:right w:type="dxa" w:w="100"/>
-            </w:tcMar>
-            <w:vAlign w:val="center"/>
-          </w:tcPr>
-          <w:p>
-            <w:pPr>
-              <w:spacing w:after="0" w:line="252"/>
-            </w:pPr>
-            <w:r>
-              <w:rPr>
-                <w:rFonts w:ascii="Arial" w:cs="Arial" w:eastAsia="Arial" w:hAnsi="Arial"/>
-                <w:b w:val="false"/>
-                <w:bCs w:val="false"/>
-                <w:sz w:val="22"/>
-                <w:szCs w:val="22"/>
-              </w:rPr>
-              <w:t xml:space="preserve">Artículo 26</w:t>
-            </w:r>
-          </w:p>
-        </w:tc>
-        <w:tc>
-          <w:tcPr>
-            <w:tcW w:type="dxa" w:w="5040"/>
-            <w:tcMar>
-              <w:top w:type="dxa" w:w="60"/>
-              <w:left w:type="dxa" w:w="100"/>
-              <w:bottom w:type="dxa" w:w="60"/>
-              <w:right w:type="dxa" w:w="100"/>
-            </w:tcMar>
-            <w:vAlign w:val="center"/>
-          </w:tcPr>
-          <w:p>
-            <w:pPr>
-              <w:spacing w:after="0" w:line="252"/>
-            </w:pPr>
-            <w:r>
-              <w:rPr>
-                <w:rFonts w:ascii="Arial" w:cs="Arial" w:eastAsia="Arial" w:hAnsi="Arial"/>
-                <w:b w:val="false"/>
-                <w:bCs w:val="false"/>
-                <w:sz w:val="22"/>
-                <w:szCs w:val="22"/>
-              </w:rPr>
-              <w:t xml:space="preserve">Entra como mantenimiento y no pide licencia mientras no se toquen elementos estructurales.</w:t>
-            </w:r>
-          </w:p>
-        </w:tc>
-      </w:tr>
-      <w:tr>
-        <w:tc>
-          <w:tcPr>
-            <w:tcW w:type="dxa" w:w="2340"/>
-            <w:tcMar>
-              <w:top w:type="dxa" w:w="60"/>
-              <w:left w:type="dxa" w:w="100"/>
-              <w:bottom w:type="dxa" w:w="60"/>
-              <w:right w:type="dxa" w:w="100"/>
-            </w:tcMar>
-            <w:vAlign w:val="center"/>
-          </w:tcPr>
-          <w:p>
-            <w:pPr>
-              <w:spacing w:after="0" w:line="252"/>
-            </w:pPr>
-            <w:r>
-              <w:rPr>
-                <w:rFonts w:ascii="Arial" w:cs="Arial" w:eastAsia="Arial" w:hAnsi="Arial"/>
-                <w:b/>
-                <w:bCs/>
-                <w:sz w:val="22"/>
-                <w:szCs w:val="22"/>
-              </w:rPr>
-              <w:t xml:space="preserve">Demolición de cuarto aislado</w:t>
-            </w:r>
-          </w:p>
-        </w:tc>
-        <w:tc>
-          <w:tcPr>
-            <w:tcW w:type="dxa" w:w="1620"/>
-            <w:tcMar>
-              <w:top w:type="dxa" w:w="60"/>
-              <w:left w:type="dxa" w:w="100"/>
-              <w:bottom w:type="dxa" w:w="60"/>
-              <w:right w:type="dxa" w:w="100"/>
-            </w:tcMar>
-            <w:vAlign w:val="center"/>
-          </w:tcPr>
-          <w:p>
-            <w:pPr>
-              <w:spacing w:after="0" w:line="252"/>
-            </w:pPr>
-            <w:r>
-              <w:rPr>
-                <w:rFonts w:ascii="Arial" w:cs="Arial" w:eastAsia="Arial" w:hAnsi="Arial"/>
-                <w:b w:val="false"/>
-                <w:bCs w:val="false"/>
-                <w:sz w:val="22"/>
-                <w:szCs w:val="22"/>
-              </w:rPr>
-              <w:t xml:space="preserve">Artículo 26</w:t>
-            </w:r>
-          </w:p>
-        </w:tc>
-        <w:tc>
-          <w:tcPr>
-            <w:tcW w:type="dxa" w:w="5040"/>
-            <w:tcMar>
-              <w:top w:type="dxa" w:w="60"/>
-              <w:left w:type="dxa" w:w="100"/>
-              <w:bottom w:type="dxa" w:w="60"/>
-              <w:right w:type="dxa" w:w="100"/>
-            </w:tcMar>
-            <w:vAlign w:val="center"/>
-          </w:tcPr>
-          <w:p>
-            <w:pPr>
-              <w:spacing w:after="0" w:line="252"/>
-            </w:pPr>
-            <w:r>
-              <w:rPr>
-                <w:rFonts w:ascii="Arial" w:cs="Arial" w:eastAsia="Arial" w:hAnsi="Arial"/>
-                <w:b w:val="false"/>
-                <w:bCs w:val="false"/>
-                <w:sz w:val="22"/>
-                <w:szCs w:val="22"/>
-              </w:rPr>
-              <w:t xml:space="preserve">Se permite sin licencia hasta 16 m² si está desocupado y no se afecta la estabilidad del resto.</w:t>
-            </w:r>
-          </w:p>
-        </w:tc>
-      </w:tr>
-      <w:tr>
-        <w:tc>
-          <w:tcPr>
-            <w:tcW w:type="dxa" w:w="2340"/>
-            <w:tcMar>
-              <w:top w:type="dxa" w:w="60"/>
-              <w:left w:type="dxa" w:w="100"/>
-              <w:bottom w:type="dxa" w:w="60"/>
-              <w:right w:type="dxa" w:w="100"/>
-            </w:tcMar>
-            <w:vAlign w:val="center"/>
-          </w:tcPr>
-          <w:p>
-            <w:pPr>
-              <w:spacing w:after="0" w:line="252"/>
-            </w:pPr>
-            <w:r>
-              <w:rPr>
-                <w:rFonts w:ascii="Arial" w:cs="Arial" w:eastAsia="Arial" w:hAnsi="Arial"/>
-                <w:b/>
-                <w:bCs/>
-                <w:sz w:val="22"/>
-                <w:szCs w:val="22"/>
-              </w:rPr>
-              <w:t xml:space="preserve">Autoconstrucción</w:t>
-            </w:r>
-          </w:p>
-        </w:tc>
-        <w:tc>
-          <w:tcPr>
-            <w:tcW w:type="dxa" w:w="1620"/>
-            <w:tcMar>
-              <w:top w:type="dxa" w:w="60"/>
-              <w:left w:type="dxa" w:w="100"/>
-              <w:bottom w:type="dxa" w:w="60"/>
-              <w:right w:type="dxa" w:w="100"/>
-            </w:tcMar>
-            <w:vAlign w:val="center"/>
-          </w:tcPr>
-          <w:p>
-            <w:pPr>
-              <w:spacing w:after="0" w:line="252"/>
-            </w:pPr>
-            <w:r>
-              <w:rPr>
-                <w:rFonts w:ascii="Arial" w:cs="Arial" w:eastAsia="Arial" w:hAnsi="Arial"/>
-                <w:b w:val="false"/>
-                <w:bCs w:val="false"/>
-                <w:sz w:val="22"/>
-                <w:szCs w:val="22"/>
-              </w:rPr>
-              <w:t xml:space="preserve">Artículo 17</w:t>
-            </w:r>
-          </w:p>
-        </w:tc>
-        <w:tc>
-          <w:tcPr>
-            <w:tcW w:type="dxa" w:w="5040"/>
-            <w:tcMar>
-              <w:top w:type="dxa" w:w="60"/>
-              <w:left w:type="dxa" w:w="100"/>
-              <w:bottom w:type="dxa" w:w="60"/>
-              <w:right w:type="dxa" w:w="100"/>
-            </w:tcMar>
-            <w:vAlign w:val="center"/>
-          </w:tcPr>
-          <w:p>
-            <w:pPr>
-              <w:spacing w:after="0" w:line="252"/>
-            </w:pPr>
-            <w:r>
-              <w:rPr>
-                <w:rFonts w:ascii="Arial" w:cs="Arial" w:eastAsia="Arial" w:hAnsi="Arial"/>
-                <w:b w:val="false"/>
-                <w:bCs w:val="false"/>
-                <w:sz w:val="22"/>
-                <w:szCs w:val="22"/>
-              </w:rPr>
-              <w:t xml:space="preserve">Quien construya o amplíe su casa hasta 60 m² en zona habitacional de alta densidad recibe asesoría gratuita con proyectos tipo y puede quedar exento del pago de derechos.</w:t>
-            </w:r>
-          </w:p>
-        </w:tc>
-      </w:tr>
-      <w:tr>
-        <w:tc>
-          <w:tcPr>
-            <w:tcW w:type="dxa" w:w="2340"/>
-            <w:tcMar>
-              <w:top w:type="dxa" w:w="60"/>
-              <w:left w:type="dxa" w:w="100"/>
-              <w:bottom w:type="dxa" w:w="60"/>
-              <w:right w:type="dxa" w:w="100"/>
-            </w:tcMar>
-            <w:vAlign w:val="center"/>
-          </w:tcPr>
-          <w:p>
-            <w:pPr>
-              <w:spacing w:after="0" w:line="252"/>
-            </w:pPr>
-            <w:r>
-              <w:rPr>
-                <w:rFonts w:ascii="Arial" w:cs="Arial" w:eastAsia="Arial" w:hAnsi="Arial"/>
-                <w:b/>
-                <w:bCs/>
-                <w:sz w:val="22"/>
-                <w:szCs w:val="22"/>
-              </w:rPr>
               <w:t xml:space="preserve">Vivienda mínima</w:t>
             </w:r>
           </w:p>
@@ -11611,89 +10947,6 @@
                 <w:sz w:val="22"/>
                 <w:szCs w:val="22"/>
               </w:rPr>
-              <w:t xml:space="preserve">Estudio de mecánica de suelos</w:t>
-            </w:r>
-          </w:p>
-        </w:tc>
-        <w:tc>
-          <w:tcPr>
-            <w:tcW w:type="dxa" w:w="1620"/>
-            <w:tcMar>
-              <w:top w:type="dxa" w:w="60"/>
-              <w:left w:type="dxa" w:w="100"/>
-              <w:bottom w:type="dxa" w:w="60"/>
-              <w:right w:type="dxa" w:w="100"/>
-            </w:tcMar>
-            <w:vAlign w:val="center"/>
-          </w:tcPr>
-          <w:p>
-            <w:pPr>
-              <w:spacing w:after="0" w:line="252"/>
-            </w:pPr>
-            <w:r>
-              <w:rPr>
-                <w:rFonts w:ascii="Arial" w:cs="Arial" w:eastAsia="Arial" w:hAnsi="Arial"/>
-                <w:b w:val="false"/>
-                <w:bCs w:val="false"/>
-                <w:sz w:val="22"/>
-                <w:szCs w:val="22"/>
-              </w:rPr>
-              <w:t xml:space="preserve">Artículo 185</w:t>
-            </w:r>
-          </w:p>
-        </w:tc>
-        <w:tc>
-          <w:tcPr>
-            <w:tcW w:type="dxa" w:w="5040"/>
-            <w:tcMar>
-              <w:top w:type="dxa" w:w="60"/>
-              <w:left w:type="dxa" w:w="100"/>
-              <w:bottom w:type="dxa" w:w="60"/>
-              <w:right w:type="dxa" w:w="100"/>
-            </w:tcMar>
-            <w:vAlign w:val="center"/>
-          </w:tcPr>
-          <w:p>
-            <w:pPr>
-              <w:spacing w:after="0" w:line="252"/>
-            </w:pPr>
-            <w:r>
-              <w:rPr>
-                <w:rFonts w:ascii="Arial" w:cs="Arial" w:eastAsia="Arial" w:hAnsi="Arial"/>
-                <w:b w:val="false"/>
-                <w:bCs w:val="false"/>
-                <w:sz w:val="22"/>
-                <w:szCs w:val="22"/>
-              </w:rPr>
-              <w:t xml:space="preserve">Es obligatorio en edificaciones de cuatro niveles o más, y cuando la Dirección lo juzgue necesario.</w:t>
-            </w:r>
-          </w:p>
-        </w:tc>
-      </w:tr>
-      <w:tr>
-        <w:tc>
-          <w:tcPr>
-            <w:tcW w:type="dxa" w:w="2340"/>
-            <w:tcMar>
-              <w:top w:type="dxa" w:w="60"/>
-              <w:left w:type="dxa" w:w="100"/>
-              <w:bottom w:type="dxa" w:w="60"/>
-              <w:right w:type="dxa" w:w="100"/>
-            </w:tcMar>
-            <w:vAlign w:val="center"/>
-          </w:tcPr>
-          <w:p>
-            <w:pPr>
-              <w:spacing w:after="0" w:line="252"/>
-            </w:pPr>
-            <w:r>
-              <w:rPr>
-                <w:rFonts w:ascii="Arial" w:cs="Arial" w:eastAsia="Arial" w:hAnsi="Arial"/>
-                <w:b/>
-                <w:bCs/>
-                <w:sz w:val="22"/>
-                <w:szCs w:val="22"/>
-              </w:rPr>
               <w:t xml:space="preserve">Revisión de colindancias</w:t>
             </w:r>
           </w:p>
@@ -12358,89 +11611,6 @@
                 <w:sz w:val="22"/>
                 <w:szCs w:val="22"/>
               </w:rPr>
-              <w:t xml:space="preserve">Elevador</w:t>
-            </w:r>
-          </w:p>
-        </w:tc>
-        <w:tc>
-          <w:tcPr>
-            <w:tcW w:type="dxa" w:w="1620"/>
-            <w:tcMar>
-              <w:top w:type="dxa" w:w="60"/>
-              <w:left w:type="dxa" w:w="100"/>
-              <w:bottom w:type="dxa" w:w="60"/>
-              <w:right w:type="dxa" w:w="100"/>
-            </w:tcMar>
-            <w:vAlign w:val="center"/>
-          </w:tcPr>
-          <w:p>
-            <w:pPr>
-              <w:spacing w:after="0" w:line="252"/>
-            </w:pPr>
-            <w:r>
-              <w:rPr>
-                <w:rFonts w:ascii="Arial" w:cs="Arial" w:eastAsia="Arial" w:hAnsi="Arial"/>
-                <w:b w:val="false"/>
-                <w:bCs w:val="false"/>
-                <w:sz w:val="22"/>
-                <w:szCs w:val="22"/>
-              </w:rPr>
-              <w:t xml:space="preserve">Artículo 193</w:t>
-            </w:r>
-          </w:p>
-        </w:tc>
-        <w:tc>
-          <w:tcPr>
-            <w:tcW w:type="dxa" w:w="5040"/>
-            <w:tcMar>
-              <w:top w:type="dxa" w:w="60"/>
-              <w:left w:type="dxa" w:w="100"/>
-              <w:bottom w:type="dxa" w:w="60"/>
-              <w:right w:type="dxa" w:w="100"/>
-            </w:tcMar>
-            <w:vAlign w:val="center"/>
-          </w:tcPr>
-          <w:p>
-            <w:pPr>
-              <w:spacing w:after="0" w:line="252"/>
-            </w:pPr>
-            <w:r>
-              <w:rPr>
-                <w:rFonts w:ascii="Arial" w:cs="Arial" w:eastAsia="Arial" w:hAnsi="Arial"/>
-                <w:b w:val="false"/>
-                <w:bCs w:val="false"/>
-                <w:sz w:val="22"/>
-                <w:szCs w:val="22"/>
-              </w:rPr>
-              <w:t xml:space="preserve">Se exige de cuatro niveles o 12 m en adelante, pero la edificación para habitación unifamiliar queda exceptuada.</w:t>
-            </w:r>
-          </w:p>
-        </w:tc>
-      </w:tr>
-      <w:tr>
-        <w:tc>
-          <w:tcPr>
-            <w:tcW w:type="dxa" w:w="2340"/>
-            <w:tcMar>
-              <w:top w:type="dxa" w:w="60"/>
-              <w:left w:type="dxa" w:w="100"/>
-              <w:bottom w:type="dxa" w:w="60"/>
-              <w:right w:type="dxa" w:w="100"/>
-            </w:tcMar>
-            <w:vAlign w:val="center"/>
-          </w:tcPr>
-          <w:p>
-            <w:pPr>
-              <w:spacing w:after="0" w:line="252"/>
-            </w:pPr>
-            <w:r>
-              <w:rPr>
-                <w:rFonts w:ascii="Arial" w:cs="Arial" w:eastAsia="Arial" w:hAnsi="Arial"/>
-                <w:b/>
-                <w:bCs/>
-                <w:sz w:val="22"/>
-                <w:szCs w:val="22"/>
-              </w:rPr>
               <w:t xml:space="preserve">Densidad de población</w:t>
             </w:r>
           </w:p>
@@ -12773,338 +11943,6 @@
                 <w:sz w:val="22"/>
                 <w:szCs w:val="22"/>
               </w:rPr>
-              <w:t xml:space="preserve">Clima artificial y calentadores</w:t>
-            </w:r>
-          </w:p>
-        </w:tc>
-        <w:tc>
-          <w:tcPr>
-            <w:tcW w:type="dxa" w:w="1620"/>
-            <w:tcMar>
-              <w:top w:type="dxa" w:w="60"/>
-              <w:left w:type="dxa" w:w="100"/>
-              <w:bottom w:type="dxa" w:w="60"/>
-              <w:right w:type="dxa" w:w="100"/>
-            </w:tcMar>
-            <w:vAlign w:val="center"/>
-          </w:tcPr>
-          <w:p>
-            <w:pPr>
-              <w:spacing w:after="0" w:line="252"/>
-            </w:pPr>
-            <w:r>
-              <w:rPr>
-                <w:rFonts w:ascii="Arial" w:cs="Arial" w:eastAsia="Arial" w:hAnsi="Arial"/>
-                <w:b w:val="false"/>
-                <w:bCs w:val="false"/>
-                <w:sz w:val="22"/>
-                <w:szCs w:val="22"/>
-              </w:rPr>
-              <w:t xml:space="preserve">Artículo 202</w:t>
-            </w:r>
-          </w:p>
-        </w:tc>
-        <w:tc>
-          <w:tcPr>
-            <w:tcW w:type="dxa" w:w="5040"/>
-            <w:tcMar>
-              <w:top w:type="dxa" w:w="60"/>
-              <w:left w:type="dxa" w:w="100"/>
-              <w:bottom w:type="dxa" w:w="60"/>
-              <w:right w:type="dxa" w:w="100"/>
-            </w:tcMar>
-            <w:vAlign w:val="center"/>
-          </w:tcPr>
-          <w:p>
-            <w:pPr>
-              <w:spacing w:after="0" w:line="252"/>
-            </w:pPr>
-            <w:r>
-              <w:rPr>
-                <w:rFonts w:ascii="Arial" w:cs="Arial" w:eastAsia="Arial" w:hAnsi="Arial"/>
-                <w:b w:val="false"/>
-                <w:bCs w:val="false"/>
-                <w:sz w:val="22"/>
-                <w:szCs w:val="22"/>
-              </w:rPr>
-              <w:t xml:space="preserve">Se usan de manera que no causen molestias, ruidos ni vibraciones y no pongan en peligro a las personas ni a la edificación.</w:t>
-            </w:r>
-          </w:p>
-        </w:tc>
-      </w:tr>
-      <w:tr>
-        <w:tc>
-          <w:tcPr>
-            <w:tcW w:type="dxa" w:w="2340"/>
-            <w:tcMar>
-              <w:top w:type="dxa" w:w="60"/>
-              <w:left w:type="dxa" w:w="100"/>
-              <w:bottom w:type="dxa" w:w="60"/>
-              <w:right w:type="dxa" w:w="100"/>
-            </w:tcMar>
-            <w:vAlign w:val="center"/>
-          </w:tcPr>
-          <w:p>
-            <w:pPr>
-              <w:spacing w:after="0" w:line="252"/>
-            </w:pPr>
-            <w:r>
-              <w:rPr>
-                <w:rFonts w:ascii="Arial" w:cs="Arial" w:eastAsia="Arial" w:hAnsi="Arial"/>
-                <w:b/>
-                <w:bCs/>
-                <w:sz w:val="22"/>
-                <w:szCs w:val="22"/>
-              </w:rPr>
-              <w:t xml:space="preserve">Proyecto de gas combustible</w:t>
-            </w:r>
-          </w:p>
-        </w:tc>
-        <w:tc>
-          <w:tcPr>
-            <w:tcW w:type="dxa" w:w="1620"/>
-            <w:tcMar>
-              <w:top w:type="dxa" w:w="60"/>
-              <w:left w:type="dxa" w:w="100"/>
-              <w:bottom w:type="dxa" w:w="60"/>
-              <w:right w:type="dxa" w:w="100"/>
-            </w:tcMar>
-            <w:vAlign w:val="center"/>
-          </w:tcPr>
-          <w:p>
-            <w:pPr>
-              <w:spacing w:after="0" w:line="252"/>
-            </w:pPr>
-            <w:r>
-              <w:rPr>
-                <w:rFonts w:ascii="Arial" w:cs="Arial" w:eastAsia="Arial" w:hAnsi="Arial"/>
-                <w:b w:val="false"/>
-                <w:bCs w:val="false"/>
-                <w:sz w:val="22"/>
-                <w:szCs w:val="22"/>
-              </w:rPr>
-              <w:t xml:space="preserve">Artículo 230</w:t>
-            </w:r>
-          </w:p>
-        </w:tc>
-        <w:tc>
-          <w:tcPr>
-            <w:tcW w:type="dxa" w:w="5040"/>
-            <w:tcMar>
-              <w:top w:type="dxa" w:w="60"/>
-              <w:left w:type="dxa" w:w="100"/>
-              <w:bottom w:type="dxa" w:w="60"/>
-              <w:right w:type="dxa" w:w="100"/>
-            </w:tcMar>
-            <w:vAlign w:val="center"/>
-          </w:tcPr>
-          <w:p>
-            <w:pPr>
-              <w:spacing w:after="0" w:line="252"/>
-            </w:pPr>
-            <w:r>
-              <w:rPr>
-                <w:rFonts w:ascii="Arial" w:cs="Arial" w:eastAsia="Arial" w:hAnsi="Arial"/>
-                <w:b w:val="false"/>
-                <w:bCs w:val="false"/>
-                <w:sz w:val="22"/>
-                <w:szCs w:val="22"/>
-              </w:rPr>
-              <w:t xml:space="preserve">Contiene el isométrico de la instalación con consumos, tuberías y caída máxima de presión, firmado por el perito.</w:t>
-            </w:r>
-          </w:p>
-        </w:tc>
-      </w:tr>
-      <w:tr>
-        <w:tc>
-          <w:tcPr>
-            <w:tcW w:type="dxa" w:w="2340"/>
-            <w:tcMar>
-              <w:top w:type="dxa" w:w="60"/>
-              <w:left w:type="dxa" w:w="100"/>
-              <w:bottom w:type="dxa" w:w="60"/>
-              <w:right w:type="dxa" w:w="100"/>
-            </w:tcMar>
-            <w:vAlign w:val="center"/>
-          </w:tcPr>
-          <w:p>
-            <w:pPr>
-              <w:spacing w:after="0" w:line="252"/>
-            </w:pPr>
-            <w:r>
-              <w:rPr>
-                <w:rFonts w:ascii="Arial" w:cs="Arial" w:eastAsia="Arial" w:hAnsi="Arial"/>
-                <w:b/>
-                <w:bCs/>
-                <w:sz w:val="22"/>
-                <w:szCs w:val="22"/>
-              </w:rPr>
-              <w:t xml:space="preserve">Clasificación de riesgo menor</w:t>
-            </w:r>
-          </w:p>
-        </w:tc>
-        <w:tc>
-          <w:tcPr>
-            <w:tcW w:type="dxa" w:w="1620"/>
-            <w:tcMar>
-              <w:top w:type="dxa" w:w="60"/>
-              <w:left w:type="dxa" w:w="100"/>
-              <w:bottom w:type="dxa" w:w="60"/>
-              <w:right w:type="dxa" w:w="100"/>
-            </w:tcMar>
-            <w:vAlign w:val="center"/>
-          </w:tcPr>
-          <w:p>
-            <w:pPr>
-              <w:spacing w:after="0" w:line="252"/>
-            </w:pPr>
-            <w:r>
-              <w:rPr>
-                <w:rFonts w:ascii="Arial" w:cs="Arial" w:eastAsia="Arial" w:hAnsi="Arial"/>
-                <w:b w:val="false"/>
-                <w:bCs w:val="false"/>
-                <w:sz w:val="22"/>
-                <w:szCs w:val="22"/>
-              </w:rPr>
-              <w:t xml:space="preserve">Artículo 208</w:t>
-            </w:r>
-          </w:p>
-        </w:tc>
-        <w:tc>
-          <w:tcPr>
-            <w:tcW w:type="dxa" w:w="5040"/>
-            <w:tcMar>
-              <w:top w:type="dxa" w:w="60"/>
-              <w:left w:type="dxa" w:w="100"/>
-              <w:bottom w:type="dxa" w:w="60"/>
-              <w:right w:type="dxa" w:w="100"/>
-            </w:tcMar>
-            <w:vAlign w:val="center"/>
-          </w:tcPr>
-          <w:p>
-            <w:pPr>
-              <w:spacing w:after="0" w:line="252"/>
-            </w:pPr>
-            <w:r>
-              <w:rPr>
-                <w:rFonts w:ascii="Arial" w:cs="Arial" w:eastAsia="Arial" w:hAnsi="Arial"/>
-                <w:b w:val="false"/>
-                <w:bCs w:val="false"/>
-                <w:sz w:val="22"/>
-                <w:szCs w:val="22"/>
-              </w:rPr>
-              <w:t xml:space="preserve">Son las edificaciones de hasta 25.00 metros de altura, hasta 250 ocupantes y hasta 3,000 m².</w:t>
-            </w:r>
-          </w:p>
-        </w:tc>
-      </w:tr>
-      <w:tr>
-        <w:tc>
-          <w:tcPr>
-            <w:tcW w:type="dxa" w:w="2340"/>
-            <w:tcMar>
-              <w:top w:type="dxa" w:w="60"/>
-              <w:left w:type="dxa" w:w="100"/>
-              <w:bottom w:type="dxa" w:w="60"/>
-              <w:right w:type="dxa" w:w="100"/>
-            </w:tcMar>
-            <w:vAlign w:val="center"/>
-          </w:tcPr>
-          <w:p>
-            <w:pPr>
-              <w:spacing w:after="0" w:line="252"/>
-            </w:pPr>
-            <w:r>
-              <w:rPr>
-                <w:rFonts w:ascii="Arial" w:cs="Arial" w:eastAsia="Arial" w:hAnsi="Arial"/>
-                <w:b/>
-                <w:bCs/>
-                <w:sz w:val="22"/>
-                <w:szCs w:val="22"/>
-              </w:rPr>
-              <w:t xml:space="preserve">Extintores</w:t>
-            </w:r>
-          </w:p>
-        </w:tc>
-        <w:tc>
-          <w:tcPr>
-            <w:tcW w:type="dxa" w:w="1620"/>
-            <w:tcMar>
-              <w:top w:type="dxa" w:w="60"/>
-              <w:left w:type="dxa" w:w="100"/>
-              <w:bottom w:type="dxa" w:w="60"/>
-              <w:right w:type="dxa" w:w="100"/>
-            </w:tcMar>
-            <w:vAlign w:val="center"/>
-          </w:tcPr>
-          <w:p>
-            <w:pPr>
-              <w:spacing w:after="0" w:line="252"/>
-            </w:pPr>
-            <w:r>
-              <w:rPr>
-                <w:rFonts w:ascii="Arial" w:cs="Arial" w:eastAsia="Arial" w:hAnsi="Arial"/>
-                <w:b w:val="false"/>
-                <w:bCs w:val="false"/>
-                <w:sz w:val="22"/>
-                <w:szCs w:val="22"/>
-              </w:rPr>
-              <w:t xml:space="preserve">Artículo 216</w:t>
-            </w:r>
-          </w:p>
-        </w:tc>
-        <w:tc>
-          <w:tcPr>
-            <w:tcW w:type="dxa" w:w="5040"/>
-            <w:tcMar>
-              <w:top w:type="dxa" w:w="60"/>
-              <w:left w:type="dxa" w:w="100"/>
-              <w:bottom w:type="dxa" w:w="60"/>
-              <w:right w:type="dxa" w:w="100"/>
-            </w:tcMar>
-            <w:vAlign w:val="center"/>
-          </w:tcPr>
-          <w:p>
-            <w:pPr>
-              <w:spacing w:after="0" w:line="252"/>
-            </w:pPr>
-            <w:r>
-              <w:rPr>
-                <w:rFonts w:ascii="Arial" w:cs="Arial" w:eastAsia="Arial" w:hAnsi="Arial"/>
-                <w:b w:val="false"/>
-                <w:bCs w:val="false"/>
-                <w:sz w:val="22"/>
-                <w:szCs w:val="22"/>
-              </w:rPr>
-              <w:t xml:space="preserve">Se piden por piso en edificaciones de riesgo menor, con excepción de los edificios destinados a habitación de hasta cinco niveles.</w:t>
-            </w:r>
-          </w:p>
-        </w:tc>
-      </w:tr>
-      <w:tr>
-        <w:tc>
-          <w:tcPr>
-            <w:tcW w:type="dxa" w:w="2340"/>
-            <w:tcMar>
-              <w:top w:type="dxa" w:w="60"/>
-              <w:left w:type="dxa" w:w="100"/>
-              <w:bottom w:type="dxa" w:w="60"/>
-              <w:right w:type="dxa" w:w="100"/>
-            </w:tcMar>
-            <w:vAlign w:val="center"/>
-          </w:tcPr>
-          <w:p>
-            <w:pPr>
-              <w:spacing w:after="0" w:line="252"/>
-            </w:pPr>
-            <w:r>
-              <w:rPr>
-                <w:rFonts w:ascii="Arial" w:cs="Arial" w:eastAsia="Arial" w:hAnsi="Arial"/>
-                <w:b/>
-                <w:bCs/>
-                <w:sz w:val="22"/>
-                <w:szCs w:val="22"/>
-              </w:rPr>
               <w:t xml:space="preserve">Chimenea</w:t>
             </w:r>
           </w:p>
@@ -13575,504 +12413,6 @@
                 <w:szCs w:val="22"/>
               </w:rPr>
               <w:t xml:space="preserve">Se construyen con materiales cuya resistencia al fuego sea de una hora por lo menos.</w:t>
-            </w:r>
-          </w:p>
-        </w:tc>
-      </w:tr>
-      <w:tr>
-        <w:tc>
-          <w:tcPr>
-            <w:tcW w:type="dxa" w:w="2340"/>
-            <w:tcMar>
-              <w:top w:type="dxa" w:w="60"/>
-              <w:left w:type="dxa" w:w="100"/>
-              <w:bottom w:type="dxa" w:w="60"/>
-              <w:right w:type="dxa" w:w="100"/>
-            </w:tcMar>
-            <w:vAlign w:val="center"/>
-          </w:tcPr>
-          <w:p>
-            <w:pPr>
-              <w:spacing w:after="0" w:line="252"/>
-            </w:pPr>
-            <w:r>
-              <w:rPr>
-                <w:rFonts w:ascii="Arial" w:cs="Arial" w:eastAsia="Arial" w:hAnsi="Arial"/>
-                <w:b/>
-                <w:bCs/>
-                <w:sz w:val="22"/>
-                <w:szCs w:val="22"/>
-              </w:rPr>
-              <w:t xml:space="preserve">Conservación del inmueble</w:t>
-            </w:r>
-          </w:p>
-        </w:tc>
-        <w:tc>
-          <w:tcPr>
-            <w:tcW w:type="dxa" w:w="1620"/>
-            <w:tcMar>
-              <w:top w:type="dxa" w:w="60"/>
-              <w:left w:type="dxa" w:w="100"/>
-              <w:bottom w:type="dxa" w:w="60"/>
-              <w:right w:type="dxa" w:w="100"/>
-            </w:tcMar>
-            <w:vAlign w:val="center"/>
-          </w:tcPr>
-          <w:p>
-            <w:pPr>
-              <w:spacing w:after="0" w:line="252"/>
-            </w:pPr>
-            <w:r>
-              <w:rPr>
-                <w:rFonts w:ascii="Arial" w:cs="Arial" w:eastAsia="Arial" w:hAnsi="Arial"/>
-                <w:b w:val="false"/>
-                <w:bCs w:val="false"/>
-                <w:sz w:val="22"/>
-                <w:szCs w:val="22"/>
-              </w:rPr>
-              <w:t xml:space="preserve">Artículo 48</w:t>
-            </w:r>
-          </w:p>
-        </w:tc>
-        <w:tc>
-          <w:tcPr>
-            <w:tcW w:type="dxa" w:w="5040"/>
-            <w:tcMar>
-              <w:top w:type="dxa" w:w="60"/>
-              <w:left w:type="dxa" w:w="100"/>
-              <w:bottom w:type="dxa" w:w="60"/>
-              <w:right w:type="dxa" w:w="100"/>
-            </w:tcMar>
-            <w:vAlign w:val="center"/>
-          </w:tcPr>
-          <w:p>
-            <w:pPr>
-              <w:spacing w:after="0" w:line="252"/>
-            </w:pPr>
-            <w:r>
-              <w:rPr>
-                <w:rFonts w:ascii="Arial" w:cs="Arial" w:eastAsia="Arial" w:hAnsi="Arial"/>
-                <w:b w:val="false"/>
-                <w:bCs w:val="false"/>
-                <w:sz w:val="22"/>
-                <w:szCs w:val="22"/>
-              </w:rPr>
-              <w:t xml:space="preserve">El propietario mantiene la construcción en buenas condiciones de estabilidad, servicio e higiene, y la fachada en buen estado para no ser peligro.</w:t>
-            </w:r>
-          </w:p>
-        </w:tc>
-      </w:tr>
-      <w:tr>
-        <w:tc>
-          <w:tcPr>
-            <w:tcW w:type="dxa" w:w="2340"/>
-            <w:tcMar>
-              <w:top w:type="dxa" w:w="60"/>
-              <w:left w:type="dxa" w:w="100"/>
-              <w:bottom w:type="dxa" w:w="60"/>
-              <w:right w:type="dxa" w:w="100"/>
-            </w:tcMar>
-            <w:vAlign w:val="center"/>
-          </w:tcPr>
-          <w:p>
-            <w:pPr>
-              <w:spacing w:after="0" w:line="252"/>
-            </w:pPr>
-            <w:r>
-              <w:rPr>
-                <w:rFonts w:ascii="Arial" w:cs="Arial" w:eastAsia="Arial" w:hAnsi="Arial"/>
-                <w:b/>
-                <w:bCs/>
-                <w:sz w:val="22"/>
-                <w:szCs w:val="22"/>
-              </w:rPr>
-              <w:t xml:space="preserve">Tapial fijo</w:t>
-            </w:r>
-          </w:p>
-        </w:tc>
-        <w:tc>
-          <w:tcPr>
-            <w:tcW w:type="dxa" w:w="1620"/>
-            <w:tcMar>
-              <w:top w:type="dxa" w:w="60"/>
-              <w:left w:type="dxa" w:w="100"/>
-              <w:bottom w:type="dxa" w:w="60"/>
-              <w:right w:type="dxa" w:w="100"/>
-            </w:tcMar>
-            <w:vAlign w:val="center"/>
-          </w:tcPr>
-          <w:p>
-            <w:pPr>
-              <w:spacing w:after="0" w:line="252"/>
-            </w:pPr>
-            <w:r>
-              <w:rPr>
-                <w:rFonts w:ascii="Arial" w:cs="Arial" w:eastAsia="Arial" w:hAnsi="Arial"/>
-                <w:b w:val="false"/>
-                <w:bCs w:val="false"/>
-                <w:sz w:val="22"/>
-                <w:szCs w:val="22"/>
-              </w:rPr>
-              <w:t xml:space="preserve">Artículo 242</w:t>
-            </w:r>
-          </w:p>
-        </w:tc>
-        <w:tc>
-          <w:tcPr>
-            <w:tcW w:type="dxa" w:w="5040"/>
-            <w:tcMar>
-              <w:top w:type="dxa" w:w="60"/>
-              <w:left w:type="dxa" w:w="100"/>
-              <w:bottom w:type="dxa" w:w="60"/>
-              <w:right w:type="dxa" w:w="100"/>
-            </w:tcMar>
-            <w:vAlign w:val="center"/>
-          </w:tcPr>
-          <w:p>
-            <w:pPr>
-              <w:spacing w:after="0" w:line="252"/>
-            </w:pPr>
-            <w:r>
-              <w:rPr>
-                <w:rFonts w:ascii="Arial" w:cs="Arial" w:eastAsia="Arial" w:hAnsi="Arial"/>
-                <w:b w:val="false"/>
-                <w:bCs w:val="false"/>
-                <w:sz w:val="22"/>
-                <w:szCs w:val="22"/>
-              </w:rPr>
-              <w:t xml:space="preserve">En obras a menos de diez metros de la vía pública, cubriendo todo el frente, con altura mínima de 2.40 metros.</w:t>
-            </w:r>
-          </w:p>
-        </w:tc>
-      </w:tr>
-      <w:tr>
-        <w:tc>
-          <w:tcPr>
-            <w:tcW w:type="dxa" w:w="2340"/>
-            <w:tcMar>
-              <w:top w:type="dxa" w:w="60"/>
-              <w:left w:type="dxa" w:w="100"/>
-              <w:bottom w:type="dxa" w:w="60"/>
-              <w:right w:type="dxa" w:w="100"/>
-            </w:tcMar>
-            <w:vAlign w:val="center"/>
-          </w:tcPr>
-          <w:p>
-            <w:pPr>
-              <w:spacing w:after="0" w:line="252"/>
-            </w:pPr>
-            <w:r>
-              <w:rPr>
-                <w:rFonts w:ascii="Arial" w:cs="Arial" w:eastAsia="Arial" w:hAnsi="Arial"/>
-                <w:b/>
-                <w:bCs/>
-                <w:sz w:val="22"/>
-                <w:szCs w:val="22"/>
-              </w:rPr>
-              <w:t xml:space="preserve">Paso cubierto</w:t>
-            </w:r>
-          </w:p>
-        </w:tc>
-        <w:tc>
-          <w:tcPr>
-            <w:tcW w:type="dxa" w:w="1620"/>
-            <w:tcMar>
-              <w:top w:type="dxa" w:w="60"/>
-              <w:left w:type="dxa" w:w="100"/>
-              <w:bottom w:type="dxa" w:w="60"/>
-              <w:right w:type="dxa" w:w="100"/>
-            </w:tcMar>
-            <w:vAlign w:val="center"/>
-          </w:tcPr>
-          <w:p>
-            <w:pPr>
-              <w:spacing w:after="0" w:line="252"/>
-            </w:pPr>
-            <w:r>
-              <w:rPr>
-                <w:rFonts w:ascii="Arial" w:cs="Arial" w:eastAsia="Arial" w:hAnsi="Arial"/>
-                <w:b w:val="false"/>
-                <w:bCs w:val="false"/>
-                <w:sz w:val="22"/>
-                <w:szCs w:val="22"/>
-              </w:rPr>
-              <w:t xml:space="preserve">Artículo 242</w:t>
-            </w:r>
-          </w:p>
-        </w:tc>
-        <w:tc>
-          <w:tcPr>
-            <w:tcW w:type="dxa" w:w="5040"/>
-            <w:tcMar>
-              <w:top w:type="dxa" w:w="60"/>
-              <w:left w:type="dxa" w:w="100"/>
-              <w:bottom w:type="dxa" w:w="60"/>
-              <w:right w:type="dxa" w:w="100"/>
-            </w:tcMar>
-            <w:vAlign w:val="center"/>
-          </w:tcPr>
-          <w:p>
-            <w:pPr>
-              <w:spacing w:after="0" w:line="252"/>
-            </w:pPr>
-            <w:r>
-              <w:rPr>
-                <w:rFonts w:ascii="Arial" w:cs="Arial" w:eastAsia="Arial" w:hAnsi="Arial"/>
-                <w:b w:val="false"/>
-                <w:bCs w:val="false"/>
-                <w:sz w:val="22"/>
-                <w:szCs w:val="22"/>
-              </w:rPr>
-              <w:t xml:space="preserve">En obras de más de diez metros de altura, con 2.40 metros de altura y 1.20 metros de anchura libre cuando menos.</w:t>
-            </w:r>
-          </w:p>
-        </w:tc>
-      </w:tr>
-      <w:tr>
-        <w:tc>
-          <w:tcPr>
-            <w:tcW w:type="dxa" w:w="2340"/>
-            <w:tcMar>
-              <w:top w:type="dxa" w:w="60"/>
-              <w:left w:type="dxa" w:w="100"/>
-              <w:bottom w:type="dxa" w:w="60"/>
-              <w:right w:type="dxa" w:w="100"/>
-            </w:tcMar>
-            <w:vAlign w:val="center"/>
-          </w:tcPr>
-          <w:p>
-            <w:pPr>
-              <w:spacing w:after="0" w:line="252"/>
-            </w:pPr>
-            <w:r>
-              <w:rPr>
-                <w:rFonts w:ascii="Arial" w:cs="Arial" w:eastAsia="Arial" w:hAnsi="Arial"/>
-                <w:b/>
-                <w:bCs/>
-                <w:sz w:val="22"/>
-                <w:szCs w:val="22"/>
-              </w:rPr>
-              <w:t xml:space="preserve">Servicios para trabajadores</w:t>
-            </w:r>
-          </w:p>
-        </w:tc>
-        <w:tc>
-          <w:tcPr>
-            <w:tcW w:type="dxa" w:w="1620"/>
-            <w:tcMar>
-              <w:top w:type="dxa" w:w="60"/>
-              <w:left w:type="dxa" w:w="100"/>
-              <w:bottom w:type="dxa" w:w="60"/>
-              <w:right w:type="dxa" w:w="100"/>
-            </w:tcMar>
-            <w:vAlign w:val="center"/>
-          </w:tcPr>
-          <w:p>
-            <w:pPr>
-              <w:spacing w:after="0" w:line="252"/>
-            </w:pPr>
-            <w:r>
-              <w:rPr>
-                <w:rFonts w:ascii="Arial" w:cs="Arial" w:eastAsia="Arial" w:hAnsi="Arial"/>
-                <w:b w:val="false"/>
-                <w:bCs w:val="false"/>
-                <w:sz w:val="22"/>
-                <w:szCs w:val="22"/>
-              </w:rPr>
-              <w:t xml:space="preserve">Artículo 244</w:t>
-            </w:r>
-          </w:p>
-        </w:tc>
-        <w:tc>
-          <w:tcPr>
-            <w:tcW w:type="dxa" w:w="5040"/>
-            <w:tcMar>
-              <w:top w:type="dxa" w:w="60"/>
-              <w:left w:type="dxa" w:w="100"/>
-              <w:bottom w:type="dxa" w:w="60"/>
-              <w:right w:type="dxa" w:w="100"/>
-            </w:tcMar>
-            <w:vAlign w:val="center"/>
-          </w:tcPr>
-          <w:p>
-            <w:pPr>
-              <w:spacing w:after="0" w:line="252"/>
-            </w:pPr>
-            <w:r>
-              <w:rPr>
-                <w:rFonts w:ascii="Arial" w:cs="Arial" w:eastAsia="Arial" w:hAnsi="Arial"/>
-                <w:b w:val="false"/>
-                <w:bCs w:val="false"/>
-                <w:sz w:val="22"/>
-                <w:szCs w:val="22"/>
-              </w:rPr>
-              <w:t xml:space="preserve">Agua potable, un sanitario portátil, excusado o letrina por cada 25 trabajadores y nunca menos de uno, más un botiquín de primeros auxilios.</w:t>
-            </w:r>
-          </w:p>
-        </w:tc>
-      </w:tr>
-      <w:tr>
-        <w:tc>
-          <w:tcPr>
-            <w:tcW w:type="dxa" w:w="2340"/>
-            <w:tcMar>
-              <w:top w:type="dxa" w:w="60"/>
-              <w:left w:type="dxa" w:w="100"/>
-              <w:bottom w:type="dxa" w:w="60"/>
-              <w:right w:type="dxa" w:w="100"/>
-            </w:tcMar>
-            <w:vAlign w:val="center"/>
-          </w:tcPr>
-          <w:p>
-            <w:pPr>
-              <w:spacing w:after="0" w:line="252"/>
-            </w:pPr>
-            <w:r>
-              <w:rPr>
-                <w:rFonts w:ascii="Arial" w:cs="Arial" w:eastAsia="Arial" w:hAnsi="Arial"/>
-                <w:b/>
-                <w:bCs/>
-                <w:sz w:val="22"/>
-                <w:szCs w:val="22"/>
-              </w:rPr>
-              <w:t xml:space="preserve">Bitácora de obra</w:t>
-            </w:r>
-          </w:p>
-        </w:tc>
-        <w:tc>
-          <w:tcPr>
-            <w:tcW w:type="dxa" w:w="1620"/>
-            <w:tcMar>
-              <w:top w:type="dxa" w:w="60"/>
-              <w:left w:type="dxa" w:w="100"/>
-              <w:bottom w:type="dxa" w:w="60"/>
-              <w:right w:type="dxa" w:w="100"/>
-            </w:tcMar>
-            <w:vAlign w:val="center"/>
-          </w:tcPr>
-          <w:p>
-            <w:pPr>
-              <w:spacing w:after="0" w:line="252"/>
-            </w:pPr>
-            <w:r>
-              <w:rPr>
-                <w:rFonts w:ascii="Arial" w:cs="Arial" w:eastAsia="Arial" w:hAnsi="Arial"/>
-                <w:b w:val="false"/>
-                <w:bCs w:val="false"/>
-                <w:sz w:val="22"/>
-                <w:szCs w:val="22"/>
-              </w:rPr>
-              <w:t xml:space="preserve">Artículo 233</w:t>
-            </w:r>
-          </w:p>
-        </w:tc>
-        <w:tc>
-          <w:tcPr>
-            <w:tcW w:type="dxa" w:w="5040"/>
-            <w:tcMar>
-              <w:top w:type="dxa" w:w="60"/>
-              <w:left w:type="dxa" w:w="100"/>
-              <w:bottom w:type="dxa" w:w="60"/>
-              <w:right w:type="dxa" w:w="100"/>
-            </w:tcMar>
-            <w:vAlign w:val="center"/>
-          </w:tcPr>
-          <w:p>
-            <w:pPr>
-              <w:spacing w:after="0" w:line="252"/>
-            </w:pPr>
-            <w:r>
-              <w:rPr>
-                <w:rFonts w:ascii="Arial" w:cs="Arial" w:eastAsia="Arial" w:hAnsi="Arial"/>
-                <w:b w:val="false"/>
-                <w:bCs w:val="false"/>
-                <w:sz w:val="22"/>
-                <w:szCs w:val="22"/>
-              </w:rPr>
-              <w:t xml:space="preserve">El director responsable la mantiene en la obra, encuadernada y foliada, a disposición de los inspectores.</w:t>
-            </w:r>
-          </w:p>
-        </w:tc>
-      </w:tr>
-      <w:tr>
-        <w:tc>
-          <w:tcPr>
-            <w:tcW w:type="dxa" w:w="2340"/>
-            <w:tcMar>
-              <w:top w:type="dxa" w:w="60"/>
-              <w:left w:type="dxa" w:w="100"/>
-              <w:bottom w:type="dxa" w:w="60"/>
-              <w:right w:type="dxa" w:w="100"/>
-            </w:tcMar>
-            <w:vAlign w:val="center"/>
-          </w:tcPr>
-          <w:p>
-            <w:pPr>
-              <w:spacing w:after="0" w:line="252"/>
-            </w:pPr>
-            <w:r>
-              <w:rPr>
-                <w:rFonts w:ascii="Arial" w:cs="Arial" w:eastAsia="Arial" w:hAnsi="Arial"/>
-                <w:b/>
-                <w:bCs/>
-                <w:sz w:val="22"/>
-                <w:szCs w:val="22"/>
-              </w:rPr>
-              <w:t xml:space="preserve">Limpieza durante la obra</w:t>
-            </w:r>
-          </w:p>
-        </w:tc>
-        <w:tc>
-          <w:tcPr>
-            <w:tcW w:type="dxa" w:w="1620"/>
-            <w:tcMar>
-              <w:top w:type="dxa" w:w="60"/>
-              <w:left w:type="dxa" w:w="100"/>
-              <w:bottom w:type="dxa" w:w="60"/>
-              <w:right w:type="dxa" w:w="100"/>
-            </w:tcMar>
-            <w:vAlign w:val="center"/>
-          </w:tcPr>
-          <w:p>
-            <w:pPr>
-              <w:spacing w:after="0" w:line="252"/>
-            </w:pPr>
-            <w:r>
-              <w:rPr>
-                <w:rFonts w:ascii="Arial" w:cs="Arial" w:eastAsia="Arial" w:hAnsi="Arial"/>
-                <w:b w:val="false"/>
-                <w:bCs w:val="false"/>
-                <w:sz w:val="22"/>
-                <w:szCs w:val="22"/>
-              </w:rPr>
-              <w:t xml:space="preserve">Artículo 233</w:t>
-            </w:r>
-          </w:p>
-        </w:tc>
-        <w:tc>
-          <w:tcPr>
-            <w:tcW w:type="dxa" w:w="5040"/>
-            <w:tcMar>
-              <w:top w:type="dxa" w:w="60"/>
-              <w:left w:type="dxa" w:w="100"/>
-              <w:bottom w:type="dxa" w:w="60"/>
-              <w:right w:type="dxa" w:w="100"/>
-            </w:tcMar>
-            <w:vAlign w:val="center"/>
-          </w:tcPr>
-          <w:p>
-            <w:pPr>
-              <w:spacing w:after="0" w:line="252"/>
-            </w:pPr>
-            <w:r>
-              <w:rPr>
-                <w:rFonts w:ascii="Arial" w:cs="Arial" w:eastAsia="Arial" w:hAnsi="Arial"/>
-                <w:b w:val="false"/>
-                <w:bCs w:val="false"/>
-                <w:sz w:val="22"/>
-                <w:szCs w:val="22"/>
-              </w:rPr>
-              <w:t xml:space="preserve">Se mantienen limpias las banquetas y las calles frente a la obra, y al terminar se retiran materiales y escombro.</w:t>
             </w:r>
           </w:p>
         </w:tc>

</xml_diff>

<commit_message>
Audit adversarial: agrega excepciones y condiciones que faltaban
Hallazgos aplicados tras revisar cada fila contra el texto del Reglamento:
- Art. 71: faltaba la excepción de 40 m para oficinas, comercio e industria.
- Art. 77: faltaba que los anchos valen hasta por 100 usuarios y el
  incremento de 60 cm por cada 100 usuarios o fracción.
- Art. 56: faltaba la regla de predios con frente a plazas o jardines.
- Art. 86: faltaba que la iluminación no crea derechos a futuro.
- Art. 98: faltaban las restricciones adicionales que puede imponer el Municipio.
- Art. 100: faltaba la condición de zonas urbanas habitacionales.
- Art. 139: decía 'área de reunión'; el Reglamento dice 'áreas de ensamblaje'.
- Art. 94: se agregan las medidas de trampolines y plataformas.

Se agrega la skill abogado-del-diablo usada para la revisión.

Co-Authored-By: Claude Opus 5 <noreply@anthropic.com>
Claude-Session: https://claude.ai/code/session_0135TezUpzBNrSUWx2ifL95q
</commit_message>
<xml_diff>
--- a/tarea/Medidas_basicas_de_una_casa.docx
+++ b/tarea/Medidas_basicas_de_una_casa.docx
@@ -4792,6 +4792,91 @@
         </w:tc>
       </w:tr>
       <w:tr>
+        <w:tc>
+          <w:tcPr>
+            <w:tcW w:type="dxa" w:w="2340"/>
+            <w:tcMar>
+              <w:top w:type="dxa" w:w="60"/>
+              <w:left w:type="dxa" w:w="100"/>
+              <w:bottom w:type="dxa" w:w="60"/>
+              <w:right w:type="dxa" w:w="100"/>
+            </w:tcMar>
+            <w:vAlign w:val="center"/>
+          </w:tcPr>
+          <w:p>
+            <w:pPr>
+              <w:spacing w:after="0" w:line="252"/>
+            </w:pPr>
+            <w:r>
+              <w:rPr>
+                <w:rFonts w:ascii="Arial" w:cs="Arial" w:eastAsia="Arial" w:hAnsi="Arial"/>
+                <w:b/>
+                <w:bCs/>
+                <w:sz w:val="22"/>
+                <w:szCs w:val="22"/>
+              </w:rPr>
+              <w:t xml:space="preserve">Predio frente a plaza o jardín</w:t>
+            </w:r>
+          </w:p>
+        </w:tc>
+        <w:tc>
+          <w:tcPr>
+            <w:tcW w:type="dxa" w:w="1620"/>
+            <w:vMerge w:val="continue"/>
+            <w:tcMar>
+              <w:top w:type="dxa" w:w="60"/>
+              <w:left w:type="dxa" w:w="100"/>
+              <w:bottom w:type="dxa" w:w="60"/>
+              <w:right w:type="dxa" w:w="100"/>
+            </w:tcMar>
+            <w:vAlign w:val="center"/>
+          </w:tcPr>
+          <w:p>
+            <w:pPr>
+              <w:spacing w:after="0" w:line="252"/>
+              <w:jc w:val="center"/>
+            </w:pPr>
+            <w:r>
+              <w:rPr>
+                <w:rFonts w:ascii="Arial" w:cs="Arial" w:eastAsia="Arial" w:hAnsi="Arial"/>
+                <w:b/>
+                <w:bCs/>
+                <w:sz w:val="22"/>
+                <w:szCs w:val="22"/>
+              </w:rPr>
+              <w:t xml:space="preserve"/>
+            </w:r>
+          </w:p>
+        </w:tc>
+        <w:tc>
+          <w:tcPr>
+            <w:tcW w:type="dxa" w:w="5040"/>
+            <w:tcMar>
+              <w:top w:type="dxa" w:w="60"/>
+              <w:left w:type="dxa" w:w="100"/>
+              <w:bottom w:type="dxa" w:w="60"/>
+              <w:right w:type="dxa" w:w="100"/>
+            </w:tcMar>
+            <w:vAlign w:val="center"/>
+          </w:tcPr>
+          <w:p>
+            <w:pPr>
+              <w:spacing w:after="0" w:line="252"/>
+            </w:pPr>
+            <w:r>
+              <w:rPr>
+                <w:rFonts w:ascii="Arial" w:cs="Arial" w:eastAsia="Arial" w:hAnsi="Arial"/>
+                <w:b w:val="false"/>
+                <w:bCs w:val="false"/>
+                <w:sz w:val="22"/>
+                <w:szCs w:val="22"/>
+              </w:rPr>
+              <w:t xml:space="preserve">En esos casos el alineamiento opuesto se localiza 5 metros hacia adentro del alineamiento de la acera opuesta.</w:t>
+            </w:r>
+          </w:p>
+        </w:tc>
+      </w:tr>
+      <w:tr>
         <w:trPr>
           <w:cantSplit/>
         </w:trPr>
@@ -7960,6 +8045,91 @@
         </w:tc>
       </w:tr>
       <w:tr>
+        <w:tc>
+          <w:tcPr>
+            <w:tcW w:type="dxa" w:w="2340"/>
+            <w:tcMar>
+              <w:top w:type="dxa" w:w="60"/>
+              <w:left w:type="dxa" w:w="100"/>
+              <w:bottom w:type="dxa" w:w="60"/>
+              <w:right w:type="dxa" w:w="100"/>
+            </w:tcMar>
+            <w:vAlign w:val="center"/>
+          </w:tcPr>
+          <w:p>
+            <w:pPr>
+              <w:spacing w:after="0" w:line="252"/>
+            </w:pPr>
+            <w:r>
+              <w:rPr>
+                <w:rFonts w:ascii="Arial" w:cs="Arial" w:eastAsia="Arial" w:hAnsi="Arial"/>
+                <w:b/>
+                <w:bCs/>
+                <w:sz w:val="22"/>
+                <w:szCs w:val="22"/>
+              </w:rPr>
+              <w:t xml:space="preserve">Excepción de la distancia</w:t>
+            </w:r>
+          </w:p>
+        </w:tc>
+        <w:tc>
+          <w:tcPr>
+            <w:tcW w:type="dxa" w:w="1620"/>
+            <w:vMerge w:val="continue"/>
+            <w:tcMar>
+              <w:top w:type="dxa" w:w="60"/>
+              <w:left w:type="dxa" w:w="100"/>
+              <w:bottom w:type="dxa" w:w="60"/>
+              <w:right w:type="dxa" w:w="100"/>
+            </w:tcMar>
+            <w:vAlign w:val="center"/>
+          </w:tcPr>
+          <w:p>
+            <w:pPr>
+              <w:spacing w:after="0" w:line="252"/>
+              <w:jc w:val="center"/>
+            </w:pPr>
+            <w:r>
+              <w:rPr>
+                <w:rFonts w:ascii="Arial" w:cs="Arial" w:eastAsia="Arial" w:hAnsi="Arial"/>
+                <w:b/>
+                <w:bCs/>
+                <w:sz w:val="22"/>
+                <w:szCs w:val="22"/>
+              </w:rPr>
+              <w:t xml:space="preserve"/>
+            </w:r>
+          </w:p>
+        </w:tc>
+        <w:tc>
+          <w:tcPr>
+            <w:tcW w:type="dxa" w:w="5040"/>
+            <w:tcMar>
+              <w:top w:type="dxa" w:w="60"/>
+              <w:left w:type="dxa" w:w="100"/>
+              <w:bottom w:type="dxa" w:w="60"/>
+              <w:right w:type="dxa" w:w="100"/>
+            </w:tcMar>
+            <w:vAlign w:val="center"/>
+          </w:tcPr>
+          <w:p>
+            <w:pPr>
+              <w:spacing w:after="0" w:line="252"/>
+            </w:pPr>
+            <w:r>
+              <w:rPr>
+                <w:rFonts w:ascii="Arial" w:cs="Arial" w:eastAsia="Arial" w:hAnsi="Arial"/>
+                <w:b w:val="false"/>
+                <w:bCs w:val="false"/>
+                <w:sz w:val="22"/>
+                <w:szCs w:val="22"/>
+              </w:rPr>
+              <w:t xml:space="preserve">En edificaciones de oficinas, comercio e industria la distancia puede ser de 40 metros como máximo.</w:t>
+            </w:r>
+          </w:p>
+        </w:tc>
+      </w:tr>
+      <w:tr>
         <w:trPr>
           <w:cantSplit/>
         </w:trPr>
@@ -10568,6 +10738,91 @@
                 <w:sz w:val="22"/>
                 <w:szCs w:val="22"/>
               </w:rPr>
+              <w:t xml:space="preserve">Hasta cuántos usuarios sirve la tabla</w:t>
+            </w:r>
+          </w:p>
+        </w:tc>
+        <w:tc>
+          <w:tcPr>
+            <w:tcW w:type="dxa" w:w="1620"/>
+            <w:vMerge w:val="continue"/>
+            <w:tcMar>
+              <w:top w:type="dxa" w:w="60"/>
+              <w:left w:type="dxa" w:w="100"/>
+              <w:bottom w:type="dxa" w:w="60"/>
+              <w:right w:type="dxa" w:w="100"/>
+            </w:tcMar>
+            <w:vAlign w:val="center"/>
+          </w:tcPr>
+          <w:p>
+            <w:pPr>
+              <w:spacing w:after="0" w:line="252"/>
+              <w:jc w:val="center"/>
+            </w:pPr>
+            <w:r>
+              <w:rPr>
+                <w:rFonts w:ascii="Arial" w:cs="Arial" w:eastAsia="Arial" w:hAnsi="Arial"/>
+                <w:b/>
+                <w:bCs/>
+                <w:sz w:val="22"/>
+                <w:szCs w:val="22"/>
+              </w:rPr>
+              <w:t xml:space="preserve"/>
+            </w:r>
+          </w:p>
+        </w:tc>
+        <w:tc>
+          <w:tcPr>
+            <w:tcW w:type="dxa" w:w="5040"/>
+            <w:tcMar>
+              <w:top w:type="dxa" w:w="60"/>
+              <w:left w:type="dxa" w:w="100"/>
+              <w:bottom w:type="dxa" w:w="60"/>
+              <w:right w:type="dxa" w:w="100"/>
+            </w:tcMar>
+            <w:vAlign w:val="center"/>
+          </w:tcPr>
+          <w:p>
+            <w:pPr>
+              <w:spacing w:after="0" w:line="252"/>
+            </w:pPr>
+            <w:r>
+              <w:rPr>
+                <w:rFonts w:ascii="Arial" w:cs="Arial" w:eastAsia="Arial" w:hAnsi="Arial"/>
+                <w:b w:val="false"/>
+                <w:bCs w:val="false"/>
+                <w:sz w:val="22"/>
+                <w:szCs w:val="22"/>
+              </w:rPr>
+              <w:t xml:space="preserve">Los anchos de la tabla valen hasta por 100 usuarios; si se considera una población mayor, el ancho mínimo se incrementa 60 centímetros por cada 100 usuarios o fracción.</w:t>
+            </w:r>
+          </w:p>
+        </w:tc>
+      </w:tr>
+      <w:tr>
+        <w:tc>
+          <w:tcPr>
+            <w:tcW w:type="dxa" w:w="2340"/>
+            <w:tcMar>
+              <w:top w:type="dxa" w:w="60"/>
+              <w:left w:type="dxa" w:w="100"/>
+              <w:bottom w:type="dxa" w:w="60"/>
+              <w:right w:type="dxa" w:w="100"/>
+            </w:tcMar>
+            <w:vAlign w:val="center"/>
+          </w:tcPr>
+          <w:p>
+            <w:pPr>
+              <w:spacing w:after="0" w:line="252"/>
+            </w:pPr>
+            <w:r>
+              <w:rPr>
+                <w:rFonts w:ascii="Arial" w:cs="Arial" w:eastAsia="Arial" w:hAnsi="Arial"/>
+                <w:b/>
+                <w:bCs/>
+                <w:sz w:val="22"/>
+                <w:szCs w:val="22"/>
+              </w:rPr>
               <w:t xml:space="preserve">Puerta de acceso principal</w:t>
             </w:r>
           </w:p>
@@ -12321,6 +12576,91 @@
         </w:tc>
       </w:tr>
       <w:tr>
+        <w:tc>
+          <w:tcPr>
+            <w:tcW w:type="dxa" w:w="2340"/>
+            <w:tcMar>
+              <w:top w:type="dxa" w:w="60"/>
+              <w:left w:type="dxa" w:w="100"/>
+              <w:bottom w:type="dxa" w:w="60"/>
+              <w:right w:type="dxa" w:w="100"/>
+            </w:tcMar>
+            <w:vAlign w:val="center"/>
+          </w:tcPr>
+          <w:p>
+            <w:pPr>
+              <w:spacing w:after="0" w:line="252"/>
+            </w:pPr>
+            <w:r>
+              <w:rPr>
+                <w:rFonts w:ascii="Arial" w:cs="Arial" w:eastAsia="Arial" w:hAnsi="Arial"/>
+                <w:b/>
+                <w:bCs/>
+                <w:sz w:val="22"/>
+                <w:szCs w:val="22"/>
+              </w:rPr>
+              <w:t xml:space="preserve">Sin derechos a futuro</w:t>
+            </w:r>
+          </w:p>
+        </w:tc>
+        <w:tc>
+          <w:tcPr>
+            <w:tcW w:type="dxa" w:w="1620"/>
+            <w:vMerge w:val="continue"/>
+            <w:tcMar>
+              <w:top w:type="dxa" w:w="60"/>
+              <w:left w:type="dxa" w:w="100"/>
+              <w:bottom w:type="dxa" w:w="60"/>
+              <w:right w:type="dxa" w:w="100"/>
+            </w:tcMar>
+            <w:vAlign w:val="center"/>
+          </w:tcPr>
+          <w:p>
+            <w:pPr>
+              <w:spacing w:after="0" w:line="252"/>
+              <w:jc w:val="center"/>
+            </w:pPr>
+            <w:r>
+              <w:rPr>
+                <w:rFonts w:ascii="Arial" w:cs="Arial" w:eastAsia="Arial" w:hAnsi="Arial"/>
+                <w:b/>
+                <w:bCs/>
+                <w:sz w:val="22"/>
+                <w:szCs w:val="22"/>
+              </w:rPr>
+              <w:t xml:space="preserve"/>
+            </w:r>
+          </w:p>
+        </w:tc>
+        <w:tc>
+          <w:tcPr>
+            <w:tcW w:type="dxa" w:w="5040"/>
+            <w:tcMar>
+              <w:top w:type="dxa" w:w="60"/>
+              <w:left w:type="dxa" w:w="100"/>
+              <w:bottom w:type="dxa" w:w="60"/>
+              <w:right w:type="dxa" w:w="100"/>
+            </w:tcMar>
+            <w:vAlign w:val="center"/>
+          </w:tcPr>
+          <w:p>
+            <w:pPr>
+              <w:spacing w:after="0" w:line="252"/>
+            </w:pPr>
+            <w:r>
+              <w:rPr>
+                <w:rFonts w:ascii="Arial" w:cs="Arial" w:eastAsia="Arial" w:hAnsi="Arial"/>
+                <w:b w:val="false"/>
+                <w:bCs w:val="false"/>
+                <w:sz w:val="22"/>
+                <w:szCs w:val="22"/>
+              </w:rPr>
+              <w:t xml:space="preserve">Esa iluminación no crea derechos frente a futuras edificaciones vecinas que lleguen a obstruirla.</w:t>
+            </w:r>
+          </w:p>
+        </w:tc>
+      </w:tr>
+      <w:tr>
         <w:trPr>
           <w:cantSplit/>
         </w:trPr>
@@ -13971,6 +14311,346 @@
         </w:tc>
       </w:tr>
       <w:tr>
+        <w:tc>
+          <w:tcPr>
+            <w:tcW w:type="dxa" w:w="2340"/>
+            <w:tcMar>
+              <w:top w:type="dxa" w:w="60"/>
+              <w:left w:type="dxa" w:w="100"/>
+              <w:bottom w:type="dxa" w:w="60"/>
+              <w:right w:type="dxa" w:w="100"/>
+            </w:tcMar>
+            <w:vAlign w:val="center"/>
+          </w:tcPr>
+          <w:p>
+            <w:pPr>
+              <w:spacing w:after="0" w:line="252"/>
+            </w:pPr>
+            <w:r>
+              <w:rPr>
+                <w:rFonts w:ascii="Arial" w:cs="Arial" w:eastAsia="Arial" w:hAnsi="Arial"/>
+                <w:b/>
+                <w:bCs/>
+                <w:sz w:val="22"/>
+                <w:szCs w:val="22"/>
+              </w:rPr>
+              <w:t xml:space="preserve">Altura de trampolines y plataformas</w:t>
+            </w:r>
+          </w:p>
+        </w:tc>
+        <w:tc>
+          <w:tcPr>
+            <w:tcW w:type="dxa" w:w="1620"/>
+            <w:vMerge w:val="continue"/>
+            <w:tcMar>
+              <w:top w:type="dxa" w:w="60"/>
+              <w:left w:type="dxa" w:w="100"/>
+              <w:bottom w:type="dxa" w:w="60"/>
+              <w:right w:type="dxa" w:w="100"/>
+            </w:tcMar>
+            <w:vAlign w:val="center"/>
+          </w:tcPr>
+          <w:p>
+            <w:pPr>
+              <w:spacing w:after="0" w:line="252"/>
+              <w:jc w:val="center"/>
+            </w:pPr>
+            <w:r>
+              <w:rPr>
+                <w:rFonts w:ascii="Arial" w:cs="Arial" w:eastAsia="Arial" w:hAnsi="Arial"/>
+                <w:b/>
+                <w:bCs/>
+                <w:sz w:val="22"/>
+                <w:szCs w:val="22"/>
+              </w:rPr>
+              <w:t xml:space="preserve"/>
+            </w:r>
+          </w:p>
+        </w:tc>
+        <w:tc>
+          <w:tcPr>
+            <w:tcW w:type="dxa" w:w="5040"/>
+            <w:tcMar>
+              <w:top w:type="dxa" w:w="60"/>
+              <w:left w:type="dxa" w:w="100"/>
+              <w:bottom w:type="dxa" w:w="60"/>
+              <w:right w:type="dxa" w:w="100"/>
+            </w:tcMar>
+            <w:vAlign w:val="center"/>
+          </w:tcPr>
+          <w:p>
+            <w:pPr>
+              <w:spacing w:after="0" w:line="252"/>
+            </w:pPr>
+            <w:r>
+              <w:rPr>
+                <w:rFonts w:ascii="Arial" w:cs="Arial" w:eastAsia="Arial" w:hAnsi="Arial"/>
+                <w:b w:val="false"/>
+                <w:bCs w:val="false"/>
+                <w:sz w:val="22"/>
+                <w:szCs w:val="22"/>
+              </w:rPr>
+              <w:t xml:space="preserve">Las alturas máximas permitidas son de 3.00 metros para los trampolines y de 10.00 metros para las plataformas.</w:t>
+            </w:r>
+          </w:p>
+        </w:tc>
+      </w:tr>
+      <w:tr>
+        <w:tc>
+          <w:tcPr>
+            <w:tcW w:type="dxa" w:w="2340"/>
+            <w:tcMar>
+              <w:top w:type="dxa" w:w="60"/>
+              <w:left w:type="dxa" w:w="100"/>
+              <w:bottom w:type="dxa" w:w="60"/>
+              <w:right w:type="dxa" w:w="100"/>
+            </w:tcMar>
+            <w:vAlign w:val="center"/>
+          </w:tcPr>
+          <w:p>
+            <w:pPr>
+              <w:spacing w:after="0" w:line="252"/>
+            </w:pPr>
+            <w:r>
+              <w:rPr>
+                <w:rFonts w:ascii="Arial" w:cs="Arial" w:eastAsia="Arial" w:hAnsi="Arial"/>
+                <w:b/>
+                <w:bCs/>
+                <w:sz w:val="22"/>
+                <w:szCs w:val="22"/>
+              </w:rPr>
+              <w:t xml:space="preserve">Ancho de trampolines y plataformas</w:t>
+            </w:r>
+          </w:p>
+        </w:tc>
+        <w:tc>
+          <w:tcPr>
+            <w:tcW w:type="dxa" w:w="1620"/>
+            <w:vMerge w:val="continue"/>
+            <w:tcMar>
+              <w:top w:type="dxa" w:w="60"/>
+              <w:left w:type="dxa" w:w="100"/>
+              <w:bottom w:type="dxa" w:w="60"/>
+              <w:right w:type="dxa" w:w="100"/>
+            </w:tcMar>
+            <w:vAlign w:val="center"/>
+          </w:tcPr>
+          <w:p>
+            <w:pPr>
+              <w:spacing w:after="0" w:line="252"/>
+              <w:jc w:val="center"/>
+            </w:pPr>
+            <w:r>
+              <w:rPr>
+                <w:rFonts w:ascii="Arial" w:cs="Arial" w:eastAsia="Arial" w:hAnsi="Arial"/>
+                <w:b/>
+                <w:bCs/>
+                <w:sz w:val="22"/>
+                <w:szCs w:val="22"/>
+              </w:rPr>
+              <w:t xml:space="preserve"/>
+            </w:r>
+          </w:p>
+        </w:tc>
+        <w:tc>
+          <w:tcPr>
+            <w:tcW w:type="dxa" w:w="5040"/>
+            <w:tcMar>
+              <w:top w:type="dxa" w:w="60"/>
+              <w:left w:type="dxa" w:w="100"/>
+              <w:bottom w:type="dxa" w:w="60"/>
+              <w:right w:type="dxa" w:w="100"/>
+            </w:tcMar>
+            <w:vAlign w:val="center"/>
+          </w:tcPr>
+          <w:p>
+            <w:pPr>
+              <w:spacing w:after="0" w:line="252"/>
+            </w:pPr>
+            <w:r>
+              <w:rPr>
+                <w:rFonts w:ascii="Arial" w:cs="Arial" w:eastAsia="Arial" w:hAnsi="Arial"/>
+                <w:b w:val="false"/>
+                <w:bCs w:val="false"/>
+                <w:sz w:val="22"/>
+                <w:szCs w:val="22"/>
+              </w:rPr>
+              <w:t xml:space="preserve">El trampolín lleva 0.50 metros de ancho y la plataforma 2.00 metros como mínimo, en los dos casos con superficie antiderrapante.</w:t>
+            </w:r>
+          </w:p>
+        </w:tc>
+      </w:tr>
+      <w:tr>
+        <w:tc>
+          <w:tcPr>
+            <w:tcW w:type="dxa" w:w="2340"/>
+            <w:tcMar>
+              <w:top w:type="dxa" w:w="60"/>
+              <w:left w:type="dxa" w:w="100"/>
+              <w:bottom w:type="dxa" w:w="60"/>
+              <w:right w:type="dxa" w:w="100"/>
+            </w:tcMar>
+            <w:vAlign w:val="center"/>
+          </w:tcPr>
+          <w:p>
+            <w:pPr>
+              <w:spacing w:after="0" w:line="252"/>
+            </w:pPr>
+            <w:r>
+              <w:rPr>
+                <w:rFonts w:ascii="Arial" w:cs="Arial" w:eastAsia="Arial" w:hAnsi="Arial"/>
+                <w:b/>
+                <w:bCs/>
+                <w:sz w:val="22"/>
+                <w:szCs w:val="22"/>
+              </w:rPr>
+              <w:t xml:space="preserve">Escalera del trampolín</w:t>
+            </w:r>
+          </w:p>
+        </w:tc>
+        <w:tc>
+          <w:tcPr>
+            <w:tcW w:type="dxa" w:w="1620"/>
+            <w:vMerge w:val="continue"/>
+            <w:tcMar>
+              <w:top w:type="dxa" w:w="60"/>
+              <w:left w:type="dxa" w:w="100"/>
+              <w:bottom w:type="dxa" w:w="60"/>
+              <w:right w:type="dxa" w:w="100"/>
+            </w:tcMar>
+            <w:vAlign w:val="center"/>
+          </w:tcPr>
+          <w:p>
+            <w:pPr>
+              <w:spacing w:after="0" w:line="252"/>
+              <w:jc w:val="center"/>
+            </w:pPr>
+            <w:r>
+              <w:rPr>
+                <w:rFonts w:ascii="Arial" w:cs="Arial" w:eastAsia="Arial" w:hAnsi="Arial"/>
+                <w:b/>
+                <w:bCs/>
+                <w:sz w:val="22"/>
+                <w:szCs w:val="22"/>
+              </w:rPr>
+              <w:t xml:space="preserve"/>
+            </w:r>
+          </w:p>
+        </w:tc>
+        <w:tc>
+          <w:tcPr>
+            <w:tcW w:type="dxa" w:w="5040"/>
+            <w:tcMar>
+              <w:top w:type="dxa" w:w="60"/>
+              <w:left w:type="dxa" w:w="100"/>
+              <w:bottom w:type="dxa" w:w="60"/>
+              <w:right w:type="dxa" w:w="100"/>
+            </w:tcMar>
+            <w:vAlign w:val="center"/>
+          </w:tcPr>
+          <w:p>
+            <w:pPr>
+              <w:spacing w:after="0" w:line="252"/>
+            </w:pPr>
+            <w:r>
+              <w:rPr>
+                <w:rFonts w:ascii="Arial" w:cs="Arial" w:eastAsia="Arial" w:hAnsi="Arial"/>
+                <w:b w:val="false"/>
+                <w:bCs w:val="false"/>
+                <w:sz w:val="22"/>
+                <w:szCs w:val="22"/>
+              </w:rPr>
+              <w:t xml:space="preserve">De tramos rectos, con huellas de 25 centímetros cuando menos y peraltes de 18 centímetros como máximo.</w:t>
+            </w:r>
+          </w:p>
+        </w:tc>
+      </w:tr>
+      <w:tr>
+        <w:tc>
+          <w:tcPr>
+            <w:tcW w:type="dxa" w:w="2340"/>
+            <w:tcMar>
+              <w:top w:type="dxa" w:w="60"/>
+              <w:left w:type="dxa" w:w="100"/>
+              <w:bottom w:type="dxa" w:w="60"/>
+              <w:right w:type="dxa" w:w="100"/>
+            </w:tcMar>
+            <w:vAlign w:val="center"/>
+          </w:tcPr>
+          <w:p>
+            <w:pPr>
+              <w:spacing w:after="0" w:line="252"/>
+            </w:pPr>
+            <w:r>
+              <w:rPr>
+                <w:rFonts w:ascii="Arial" w:cs="Arial" w:eastAsia="Arial" w:hAnsi="Arial"/>
+                <w:b/>
+                <w:bCs/>
+                <w:sz w:val="22"/>
+                <w:szCs w:val="22"/>
+              </w:rPr>
+              <w:t xml:space="preserve">Barandal del trampolín</w:t>
+            </w:r>
+          </w:p>
+        </w:tc>
+        <w:tc>
+          <w:tcPr>
+            <w:tcW w:type="dxa" w:w="1620"/>
+            <w:vMerge w:val="continue"/>
+            <w:tcMar>
+              <w:top w:type="dxa" w:w="60"/>
+              <w:left w:type="dxa" w:w="100"/>
+              <w:bottom w:type="dxa" w:w="60"/>
+              <w:right w:type="dxa" w:w="100"/>
+            </w:tcMar>
+            <w:vAlign w:val="center"/>
+          </w:tcPr>
+          <w:p>
+            <w:pPr>
+              <w:spacing w:after="0" w:line="252"/>
+              <w:jc w:val="center"/>
+            </w:pPr>
+            <w:r>
+              <w:rPr>
+                <w:rFonts w:ascii="Arial" w:cs="Arial" w:eastAsia="Arial" w:hAnsi="Arial"/>
+                <w:b/>
+                <w:bCs/>
+                <w:sz w:val="22"/>
+                <w:szCs w:val="22"/>
+              </w:rPr>
+              <w:t xml:space="preserve"/>
+            </w:r>
+          </w:p>
+        </w:tc>
+        <w:tc>
+          <w:tcPr>
+            <w:tcW w:type="dxa" w:w="5040"/>
+            <w:tcMar>
+              <w:top w:type="dxa" w:w="60"/>
+              <w:left w:type="dxa" w:w="100"/>
+              <w:bottom w:type="dxa" w:w="60"/>
+              <w:right w:type="dxa" w:w="100"/>
+            </w:tcMar>
+            <w:vAlign w:val="center"/>
+          </w:tcPr>
+          <w:p>
+            <w:pPr>
+              <w:spacing w:after="0" w:line="252"/>
+            </w:pPr>
+            <w:r>
+              <w:rPr>
+                <w:rFonts w:ascii="Arial" w:cs="Arial" w:eastAsia="Arial" w:hAnsi="Arial"/>
+                <w:b w:val="false"/>
+                <w:bCs w:val="false"/>
+                <w:sz w:val="22"/>
+                <w:szCs w:val="22"/>
+              </w:rPr>
+              <w:t xml:space="preserve">Se coloca a 90 centímetros de altura en las escaleras y en las plataformas.</w:t>
+            </w:r>
+          </w:p>
+        </w:tc>
+      </w:tr>
+      <w:tr>
         <w:trPr>
           <w:cantSplit/>
         </w:trPr>
@@ -14349,6 +15029,91 @@
         </w:tc>
       </w:tr>
       <w:tr>
+        <w:tc>
+          <w:tcPr>
+            <w:tcW w:type="dxa" w:w="2340"/>
+            <w:tcMar>
+              <w:top w:type="dxa" w:w="60"/>
+              <w:left w:type="dxa" w:w="100"/>
+              <w:bottom w:type="dxa" w:w="60"/>
+              <w:right w:type="dxa" w:w="100"/>
+            </w:tcMar>
+            <w:vAlign w:val="center"/>
+          </w:tcPr>
+          <w:p>
+            <w:pPr>
+              <w:spacing w:after="0" w:line="252"/>
+            </w:pPr>
+            <w:r>
+              <w:rPr>
+                <w:rFonts w:ascii="Arial" w:cs="Arial" w:eastAsia="Arial" w:hAnsi="Arial"/>
+                <w:b/>
+                <w:bCs/>
+                <w:sz w:val="22"/>
+                <w:szCs w:val="22"/>
+              </w:rPr>
+              <w:t xml:space="preserve">Restricciones adicionales</w:t>
+            </w:r>
+          </w:p>
+        </w:tc>
+        <w:tc>
+          <w:tcPr>
+            <w:tcW w:type="dxa" w:w="1620"/>
+            <w:vMerge w:val="continue"/>
+            <w:tcMar>
+              <w:top w:type="dxa" w:w="60"/>
+              <w:left w:type="dxa" w:w="100"/>
+              <w:bottom w:type="dxa" w:w="60"/>
+              <w:right w:type="dxa" w:w="100"/>
+            </w:tcMar>
+            <w:vAlign w:val="center"/>
+          </w:tcPr>
+          <w:p>
+            <w:pPr>
+              <w:spacing w:after="0" w:line="252"/>
+              <w:jc w:val="center"/>
+            </w:pPr>
+            <w:r>
+              <w:rPr>
+                <w:rFonts w:ascii="Arial" w:cs="Arial" w:eastAsia="Arial" w:hAnsi="Arial"/>
+                <w:b/>
+                <w:bCs/>
+                <w:sz w:val="22"/>
+                <w:szCs w:val="22"/>
+              </w:rPr>
+              <w:t xml:space="preserve"/>
+            </w:r>
+          </w:p>
+        </w:tc>
+        <w:tc>
+          <w:tcPr>
+            <w:tcW w:type="dxa" w:w="5040"/>
+            <w:tcMar>
+              <w:top w:type="dxa" w:w="60"/>
+              <w:left w:type="dxa" w:w="100"/>
+              <w:bottom w:type="dxa" w:w="60"/>
+              <w:right w:type="dxa" w:w="100"/>
+            </w:tcMar>
+            <w:vAlign w:val="center"/>
+          </w:tcPr>
+          <w:p>
+            <w:pPr>
+              <w:spacing w:after="0" w:line="252"/>
+            </w:pPr>
+            <w:r>
+              <w:rPr>
+                <w:rFonts w:ascii="Arial" w:cs="Arial" w:eastAsia="Arial" w:hAnsi="Arial"/>
+                <w:b w:val="false"/>
+                <w:bCs w:val="false"/>
+                <w:sz w:val="22"/>
+                <w:szCs w:val="22"/>
+              </w:rPr>
+              <w:t xml:space="preserve">Si las sombras afectan viviendas vecinas, el Municipio puede imponer restricciones extra de ubicación en el predio o de altura.</w:t>
+            </w:r>
+          </w:p>
+        </w:tc>
+      </w:tr>
+      <w:tr>
         <w:trPr>
           <w:cantSplit/>
         </w:trPr>
@@ -14595,7 +15360,7 @@
                 <w:sz w:val="22"/>
                 <w:szCs w:val="22"/>
               </w:rPr>
-              <w:t xml:space="preserve">Las de cinco niveles o más que formen parte de los paramentos de patios de iluminación y ventilación vecinos llevan acabados de colores claros.</w:t>
+              <w:t xml:space="preserve">Las de cinco niveles o más que formen parte de los paramentos de patios de iluminación y ventilación de las edificaciones vecinas, en zonas urbanas habitacionales según los programas parciales, llevan acabados de colores claros.</w:t>
             </w:r>
           </w:p>
         </w:tc>
@@ -15465,7 +16230,7 @@
                 <w:sz w:val="22"/>
                 <w:szCs w:val="22"/>
               </w:rPr>
-              <w:t xml:space="preserve">Techo de jardín o reunión</w:t>
+              <w:t xml:space="preserve">Techo de jardín o ensamblaje</w:t>
             </w:r>
           </w:p>
         </w:tc>
@@ -15521,7 +16286,7 @@
                 <w:sz w:val="22"/>
                 <w:szCs w:val="22"/>
               </w:rPr>
-              <w:t xml:space="preserve">Si se usa como jardín o área de reunión se diseña para 500 kg/m².</w:t>
+              <w:t xml:space="preserve">Si se usa como jardín o como área de ensamblaje se diseña para 500 kg/m².</w:t>
             </w:r>
           </w:p>
         </w:tc>

</xml_diff>